<commit_message>
completed assignment 2 DSA
</commit_message>
<xml_diff>
--- a/CSC-575-DSA/Assignments/Assignment 2/Assignment 2-1.docx
+++ b/CSC-575-DSA/Assignments/Assignment 2/Assignment 2-1.docx
@@ -121,6 +121,7 @@
                                 <w:dataBinding w:prefixMappings="xmlns:ns0='http://purl.org/dc/elements/1.1/' xmlns:ns1='http://schemas.openxmlformats.org/package/2006/metadata/core-properties' " w:xpath="/ns1:coreProperties[1]/ns0:subject[1]" w:storeItemID="{6C3C8BC8-F283-45AE-878A-BAB7291924A1}"/>
                                 <w:text/>
                               </w:sdtPr>
+                              <w:sdtEndPr/>
                               <w:sdtContent>
                                 <w:r>
                                   <w:rPr>
@@ -215,6 +216,7 @@
                               <w:dataBinding w:prefixMappings="xmlns:ns0='http://schemas.microsoft.com/office/2006/coverPageProps'" w:xpath="/ns0:CoverPageProperties[1]/ns0:Abstract[1]" w:storeItemID="{55AF091B-3C7A-41E3-B477-F2FDAA23CFDA}"/>
                               <w:text/>
                             </w:sdtPr>
+                            <w:sdtEndPr/>
                             <w:sdtContent>
                               <w:p>
                                 <w:pPr>
@@ -350,6 +352,7 @@
                           <w:dataBinding w:prefixMappings="xmlns:ns0='http://purl.org/dc/elements/1.1/' xmlns:ns1='http://schemas.openxmlformats.org/package/2006/metadata/core-properties' " w:xpath="/ns1:coreProperties[1]/ns0:subject[1]" w:storeItemID="{6C3C8BC8-F283-45AE-878A-BAB7291924A1}"/>
                           <w:text/>
                         </w:sdtPr>
+                        <w:sdtEndPr/>
                         <w:sdtContent>
                           <w:r>
                             <w:rPr>
@@ -444,6 +447,7 @@
                         <w:dataBinding w:prefixMappings="xmlns:ns0='http://schemas.microsoft.com/office/2006/coverPageProps'" w:xpath="/ns0:CoverPageProperties[1]/ns0:Abstract[1]" w:storeItemID="{55AF091B-3C7A-41E3-B477-F2FDAA23CFDA}"/>
                         <w:text/>
                       </w:sdtPr>
+                      <w:sdtEndPr/>
                       <w:sdtContent>
                         <w:p>
                           <w:pPr>
@@ -773,6 +777,7 @@
           <w:docPartUnique/>
         </w:docPartObj>
       </w:sdtPr>
+      <w:sdtEndPr/>
       <w:sdtContent>
         <w:p>
           <w:pPr>
@@ -1605,6 +1610,7 @@
                                     <w:dataBinding w:prefixMappings="xmlns:ns0='http://schemas.openxmlformats.org/officeDocument/2006/extended-properties' " w:xpath="/ns0:Properties[1]/ns0:Company[1]" w:storeItemID="{6668398D-A668-4E3E-A5EB-62B293D839F1}"/>
                                     <w:text/>
                                   </w:sdtPr>
+                                  <w:sdtEndPr/>
                                   <w:sdtContent>
                                     <w:r>
                                       <w:rPr>
@@ -1901,6 +1907,7 @@
                               <w:dataBinding w:prefixMappings="xmlns:ns0='http://schemas.openxmlformats.org/officeDocument/2006/extended-properties' " w:xpath="/ns0:Properties[1]/ns0:Company[1]" w:storeItemID="{6668398D-A668-4E3E-A5EB-62B293D839F1}"/>
                               <w:text/>
                             </w:sdtPr>
+                            <w:sdtEndPr/>
                             <w:sdtContent>
                               <w:r>
                                 <w:rPr>
@@ -3324,21 +3331,15 @@
         <w:jc w:val="both"/>
         <w:rPr>
           <w:rFonts w:ascii="Times New Roman" w:hAnsi="Times New Roman" w:cs="Times New Roman"/>
-          <w:b/>
-          <w:bCs/>
-          <w:sz w:val="24"/>
-          <w:szCs w:val="24"/>
-          <w:u w:val="single"/>
-        </w:rPr>
-      </w:pPr>
-      <w:r>
-        <w:rPr>
-          <w:rFonts w:ascii="Times New Roman" w:hAnsi="Times New Roman" w:cs="Times New Roman"/>
-          <w:b/>
-          <w:bCs/>
-          <w:sz w:val="24"/>
-          <w:szCs w:val="24"/>
-          <w:u w:val="single"/>
+          <w:sz w:val="24"/>
+          <w:szCs w:val="24"/>
+        </w:rPr>
+      </w:pPr>
+      <w:r>
+        <w:rPr>
+          <w:rFonts w:ascii="Times New Roman" w:hAnsi="Times New Roman" w:cs="Times New Roman"/>
+          <w:sz w:val="24"/>
+          <w:szCs w:val="24"/>
         </w:rPr>
         <w:t>//import Linked List module</w:t>
       </w:r>
@@ -3353,21 +3354,15 @@
         <w:jc w:val="both"/>
         <w:rPr>
           <w:rFonts w:ascii="Times New Roman" w:hAnsi="Times New Roman" w:cs="Times New Roman"/>
-          <w:b/>
-          <w:bCs/>
-          <w:sz w:val="24"/>
-          <w:szCs w:val="24"/>
-          <w:u w:val="single"/>
-        </w:rPr>
-      </w:pPr>
-      <w:r>
-        <w:rPr>
-          <w:rFonts w:ascii="Times New Roman" w:hAnsi="Times New Roman" w:cs="Times New Roman"/>
-          <w:b/>
-          <w:bCs/>
-          <w:sz w:val="24"/>
-          <w:szCs w:val="24"/>
-          <w:u w:val="single"/>
+          <w:sz w:val="24"/>
+          <w:szCs w:val="24"/>
+        </w:rPr>
+      </w:pPr>
+      <w:r>
+        <w:rPr>
+          <w:rFonts w:ascii="Times New Roman" w:hAnsi="Times New Roman" w:cs="Times New Roman"/>
+          <w:sz w:val="24"/>
+          <w:szCs w:val="24"/>
         </w:rPr>
         <w:t xml:space="preserve">import </w:t>
       </w:r>
@@ -3376,11 +3371,8 @@
       <w:r>
         <w:rPr>
           <w:rFonts w:ascii="Times New Roman" w:hAnsi="Times New Roman" w:cs="Times New Roman"/>
-          <w:b/>
-          <w:bCs/>
-          <w:sz w:val="24"/>
-          <w:szCs w:val="24"/>
-          <w:u w:val="single"/>
+          <w:sz w:val="24"/>
+          <w:szCs w:val="24"/>
         </w:rPr>
         <w:t>java.util</w:t>
       </w:r>
@@ -3388,11 +3380,8 @@
       <w:r>
         <w:rPr>
           <w:rFonts w:ascii="Times New Roman" w:hAnsi="Times New Roman" w:cs="Times New Roman"/>
-          <w:b/>
-          <w:bCs/>
-          <w:sz w:val="24"/>
-          <w:szCs w:val="24"/>
-          <w:u w:val="single"/>
+          <w:sz w:val="24"/>
+          <w:szCs w:val="24"/>
         </w:rPr>
         <w:t>.</w:t>
       </w:r>
@@ -3400,11 +3389,8 @@
       <w:r>
         <w:rPr>
           <w:rFonts w:ascii="Times New Roman" w:hAnsi="Times New Roman" w:cs="Times New Roman"/>
-          <w:b/>
-          <w:bCs/>
-          <w:sz w:val="24"/>
-          <w:szCs w:val="24"/>
-          <w:u w:val="single"/>
+          <w:sz w:val="24"/>
+          <w:szCs w:val="24"/>
         </w:rPr>
         <w:t>LinkedList</w:t>
       </w:r>
@@ -3412,11 +3398,8 @@
       <w:r>
         <w:rPr>
           <w:rFonts w:ascii="Times New Roman" w:hAnsi="Times New Roman" w:cs="Times New Roman"/>
-          <w:b/>
-          <w:bCs/>
-          <w:sz w:val="24"/>
-          <w:szCs w:val="24"/>
-          <w:u w:val="single"/>
+          <w:sz w:val="24"/>
+          <w:szCs w:val="24"/>
         </w:rPr>
         <w:t>;</w:t>
       </w:r>
@@ -3432,21 +3415,15 @@
         <w:jc w:val="both"/>
         <w:rPr>
           <w:rFonts w:ascii="Times New Roman" w:hAnsi="Times New Roman" w:cs="Times New Roman"/>
-          <w:b/>
-          <w:bCs/>
-          <w:sz w:val="24"/>
-          <w:szCs w:val="24"/>
-          <w:u w:val="single"/>
-        </w:rPr>
-      </w:pPr>
-      <w:r>
-        <w:rPr>
-          <w:rFonts w:ascii="Times New Roman" w:hAnsi="Times New Roman" w:cs="Times New Roman"/>
-          <w:b/>
-          <w:bCs/>
-          <w:sz w:val="24"/>
-          <w:szCs w:val="24"/>
-          <w:u w:val="single"/>
+          <w:sz w:val="24"/>
+          <w:szCs w:val="24"/>
+        </w:rPr>
+      </w:pPr>
+      <w:r>
+        <w:rPr>
+          <w:rFonts w:ascii="Times New Roman" w:hAnsi="Times New Roman" w:cs="Times New Roman"/>
+          <w:sz w:val="24"/>
+          <w:szCs w:val="24"/>
         </w:rPr>
         <w:t xml:space="preserve">// Create </w:t>
       </w:r>
@@ -3454,11 +3431,8 @@
       <w:r>
         <w:rPr>
           <w:rFonts w:ascii="Times New Roman" w:hAnsi="Times New Roman" w:cs="Times New Roman"/>
-          <w:b/>
-          <w:bCs/>
-          <w:sz w:val="24"/>
-          <w:szCs w:val="24"/>
-          <w:u w:val="single"/>
+          <w:sz w:val="24"/>
+          <w:szCs w:val="24"/>
         </w:rPr>
         <w:t>ChecklistElement</w:t>
       </w:r>
@@ -3466,11 +3440,8 @@
       <w:r>
         <w:rPr>
           <w:rFonts w:ascii="Times New Roman" w:hAnsi="Times New Roman" w:cs="Times New Roman"/>
-          <w:b/>
-          <w:bCs/>
-          <w:sz w:val="24"/>
-          <w:szCs w:val="24"/>
-          <w:u w:val="single"/>
+          <w:sz w:val="24"/>
+          <w:szCs w:val="24"/>
         </w:rPr>
         <w:t xml:space="preserve"> Class</w:t>
       </w:r>
@@ -3485,21 +3456,15 @@
         <w:jc w:val="both"/>
         <w:rPr>
           <w:rFonts w:ascii="Times New Roman" w:hAnsi="Times New Roman" w:cs="Times New Roman"/>
-          <w:b/>
-          <w:bCs/>
-          <w:sz w:val="24"/>
-          <w:szCs w:val="24"/>
-          <w:u w:val="single"/>
-        </w:rPr>
-      </w:pPr>
-      <w:r>
-        <w:rPr>
-          <w:rFonts w:ascii="Times New Roman" w:hAnsi="Times New Roman" w:cs="Times New Roman"/>
-          <w:b/>
-          <w:bCs/>
-          <w:sz w:val="24"/>
-          <w:szCs w:val="24"/>
-          <w:u w:val="single"/>
+          <w:sz w:val="24"/>
+          <w:szCs w:val="24"/>
+        </w:rPr>
+      </w:pPr>
+      <w:r>
+        <w:rPr>
+          <w:rFonts w:ascii="Times New Roman" w:hAnsi="Times New Roman" w:cs="Times New Roman"/>
+          <w:sz w:val="24"/>
+          <w:szCs w:val="24"/>
         </w:rPr>
         <w:t xml:space="preserve">class </w:t>
       </w:r>
@@ -3508,11 +3473,8 @@
       <w:r>
         <w:rPr>
           <w:rFonts w:ascii="Times New Roman" w:hAnsi="Times New Roman" w:cs="Times New Roman"/>
-          <w:b/>
-          <w:bCs/>
-          <w:sz w:val="24"/>
-          <w:szCs w:val="24"/>
-          <w:u w:val="single"/>
+          <w:sz w:val="24"/>
+          <w:szCs w:val="24"/>
         </w:rPr>
         <w:t>CheckListElement</w:t>
       </w:r>
@@ -3520,11 +3482,8 @@
       <w:r>
         <w:rPr>
           <w:rFonts w:ascii="Times New Roman" w:hAnsi="Times New Roman" w:cs="Times New Roman"/>
-          <w:b/>
-          <w:bCs/>
-          <w:sz w:val="24"/>
-          <w:szCs w:val="24"/>
-          <w:u w:val="single"/>
+          <w:sz w:val="24"/>
+          <w:szCs w:val="24"/>
         </w:rPr>
         <w:t>{</w:t>
       </w:r>
@@ -3540,21 +3499,15 @@
         <w:jc w:val="both"/>
         <w:rPr>
           <w:rFonts w:ascii="Times New Roman" w:hAnsi="Times New Roman" w:cs="Times New Roman"/>
-          <w:b/>
-          <w:bCs/>
-          <w:sz w:val="24"/>
-          <w:szCs w:val="24"/>
-          <w:u w:val="single"/>
-        </w:rPr>
-      </w:pPr>
-      <w:r>
-        <w:rPr>
-          <w:rFonts w:ascii="Times New Roman" w:hAnsi="Times New Roman" w:cs="Times New Roman"/>
-          <w:b/>
-          <w:bCs/>
-          <w:sz w:val="24"/>
-          <w:szCs w:val="24"/>
-          <w:u w:val="single"/>
+          <w:sz w:val="24"/>
+          <w:szCs w:val="24"/>
+        </w:rPr>
+      </w:pPr>
+      <w:r>
+        <w:rPr>
+          <w:rFonts w:ascii="Times New Roman" w:hAnsi="Times New Roman" w:cs="Times New Roman"/>
+          <w:sz w:val="24"/>
+          <w:szCs w:val="24"/>
         </w:rPr>
         <w:t>    //create Main</w:t>
       </w:r>
@@ -3569,21 +3522,15 @@
         <w:jc w:val="both"/>
         <w:rPr>
           <w:rFonts w:ascii="Times New Roman" w:hAnsi="Times New Roman" w:cs="Times New Roman"/>
-          <w:b/>
-          <w:bCs/>
-          <w:sz w:val="24"/>
-          <w:szCs w:val="24"/>
-          <w:u w:val="single"/>
-        </w:rPr>
-      </w:pPr>
-      <w:r>
-        <w:rPr>
-          <w:rFonts w:ascii="Times New Roman" w:hAnsi="Times New Roman" w:cs="Times New Roman"/>
-          <w:b/>
-          <w:bCs/>
-          <w:sz w:val="24"/>
-          <w:szCs w:val="24"/>
-          <w:u w:val="single"/>
+          <w:sz w:val="24"/>
+          <w:szCs w:val="24"/>
+        </w:rPr>
+      </w:pPr>
+      <w:r>
+        <w:rPr>
+          <w:rFonts w:ascii="Times New Roman" w:hAnsi="Times New Roman" w:cs="Times New Roman"/>
+          <w:sz w:val="24"/>
+          <w:szCs w:val="24"/>
         </w:rPr>
         <w:t xml:space="preserve">    public static void </w:t>
       </w:r>
@@ -3591,11 +3538,8 @@
       <w:r>
         <w:rPr>
           <w:rFonts w:ascii="Times New Roman" w:hAnsi="Times New Roman" w:cs="Times New Roman"/>
-          <w:b/>
-          <w:bCs/>
-          <w:sz w:val="24"/>
-          <w:szCs w:val="24"/>
-          <w:u w:val="single"/>
+          <w:sz w:val="24"/>
+          <w:szCs w:val="24"/>
         </w:rPr>
         <w:t>main(String[</w:t>
       </w:r>
@@ -3603,11 +3547,8 @@
       <w:r>
         <w:rPr>
           <w:rFonts w:ascii="Times New Roman" w:hAnsi="Times New Roman" w:cs="Times New Roman"/>
-          <w:b/>
-          <w:bCs/>
-          <w:sz w:val="24"/>
-          <w:szCs w:val="24"/>
-          <w:u w:val="single"/>
+          <w:sz w:val="24"/>
+          <w:szCs w:val="24"/>
         </w:rPr>
         <w:t xml:space="preserve">] </w:t>
       </w:r>
@@ -3616,11 +3557,8 @@
       <w:r>
         <w:rPr>
           <w:rFonts w:ascii="Times New Roman" w:hAnsi="Times New Roman" w:cs="Times New Roman"/>
-          <w:b/>
-          <w:bCs/>
-          <w:sz w:val="24"/>
-          <w:szCs w:val="24"/>
-          <w:u w:val="single"/>
+          <w:sz w:val="24"/>
+          <w:szCs w:val="24"/>
         </w:rPr>
         <w:t>args</w:t>
       </w:r>
@@ -3628,11 +3566,8 @@
       <w:r>
         <w:rPr>
           <w:rFonts w:ascii="Times New Roman" w:hAnsi="Times New Roman" w:cs="Times New Roman"/>
-          <w:b/>
-          <w:bCs/>
-          <w:sz w:val="24"/>
-          <w:szCs w:val="24"/>
-          <w:u w:val="single"/>
+          <w:sz w:val="24"/>
+          <w:szCs w:val="24"/>
         </w:rPr>
         <w:t>) {</w:t>
       </w:r>
@@ -3648,11 +3583,8 @@
         <w:jc w:val="both"/>
         <w:rPr>
           <w:rFonts w:ascii="Times New Roman" w:hAnsi="Times New Roman" w:cs="Times New Roman"/>
-          <w:b/>
-          <w:bCs/>
-          <w:sz w:val="24"/>
-          <w:szCs w:val="24"/>
-          <w:u w:val="single"/>
+          <w:sz w:val="24"/>
+          <w:szCs w:val="24"/>
         </w:rPr>
       </w:pPr>
     </w:p>
@@ -3666,21 +3598,15 @@
         <w:jc w:val="both"/>
         <w:rPr>
           <w:rFonts w:ascii="Times New Roman" w:hAnsi="Times New Roman" w:cs="Times New Roman"/>
-          <w:b/>
-          <w:bCs/>
-          <w:sz w:val="24"/>
-          <w:szCs w:val="24"/>
-          <w:u w:val="single"/>
-        </w:rPr>
-      </w:pPr>
-      <w:r>
-        <w:rPr>
-          <w:rFonts w:ascii="Times New Roman" w:hAnsi="Times New Roman" w:cs="Times New Roman"/>
-          <w:b/>
-          <w:bCs/>
-          <w:sz w:val="24"/>
-          <w:szCs w:val="24"/>
-          <w:u w:val="single"/>
+          <w:sz w:val="24"/>
+          <w:szCs w:val="24"/>
+        </w:rPr>
+      </w:pPr>
+      <w:r>
+        <w:rPr>
+          <w:rFonts w:ascii="Times New Roman" w:hAnsi="Times New Roman" w:cs="Times New Roman"/>
+          <w:sz w:val="24"/>
+          <w:szCs w:val="24"/>
         </w:rPr>
         <w:t>        //Create Linked List</w:t>
       </w:r>
@@ -3695,21 +3621,15 @@
         <w:jc w:val="both"/>
         <w:rPr>
           <w:rFonts w:ascii="Times New Roman" w:hAnsi="Times New Roman" w:cs="Times New Roman"/>
-          <w:b/>
-          <w:bCs/>
-          <w:sz w:val="24"/>
-          <w:szCs w:val="24"/>
-          <w:u w:val="single"/>
-        </w:rPr>
-      </w:pPr>
-      <w:r>
-        <w:rPr>
-          <w:rFonts w:ascii="Times New Roman" w:hAnsi="Times New Roman" w:cs="Times New Roman"/>
-          <w:b/>
-          <w:bCs/>
-          <w:sz w:val="24"/>
-          <w:szCs w:val="24"/>
-          <w:u w:val="single"/>
+          <w:sz w:val="24"/>
+          <w:szCs w:val="24"/>
+        </w:rPr>
+      </w:pPr>
+      <w:r>
+        <w:rPr>
+          <w:rFonts w:ascii="Times New Roman" w:hAnsi="Times New Roman" w:cs="Times New Roman"/>
+          <w:sz w:val="24"/>
+          <w:szCs w:val="24"/>
         </w:rPr>
         <w:t xml:space="preserve">        LinkedList&lt;String&gt; </w:t>
       </w:r>
@@ -3717,11 +3637,8 @@
       <w:r>
         <w:rPr>
           <w:rFonts w:ascii="Times New Roman" w:hAnsi="Times New Roman" w:cs="Times New Roman"/>
-          <w:b/>
-          <w:bCs/>
-          <w:sz w:val="24"/>
-          <w:szCs w:val="24"/>
-          <w:u w:val="single"/>
+          <w:sz w:val="24"/>
+          <w:szCs w:val="24"/>
         </w:rPr>
         <w:t>lst</w:t>
       </w:r>
@@ -3729,11 +3646,8 @@
       <w:r>
         <w:rPr>
           <w:rFonts w:ascii="Times New Roman" w:hAnsi="Times New Roman" w:cs="Times New Roman"/>
-          <w:b/>
-          <w:bCs/>
-          <w:sz w:val="24"/>
-          <w:szCs w:val="24"/>
-          <w:u w:val="single"/>
+          <w:sz w:val="24"/>
+          <w:szCs w:val="24"/>
         </w:rPr>
         <w:t xml:space="preserve"> = new LinkedList&lt;String</w:t>
       </w:r>
@@ -3741,11 +3655,8 @@
       <w:r>
         <w:rPr>
           <w:rFonts w:ascii="Times New Roman" w:hAnsi="Times New Roman" w:cs="Times New Roman"/>
-          <w:b/>
-          <w:bCs/>
-          <w:sz w:val="24"/>
-          <w:szCs w:val="24"/>
-          <w:u w:val="single"/>
+          <w:sz w:val="24"/>
+          <w:szCs w:val="24"/>
         </w:rPr>
         <w:t>&gt;();</w:t>
       </w:r>
@@ -3761,11 +3672,8 @@
         <w:jc w:val="both"/>
         <w:rPr>
           <w:rFonts w:ascii="Times New Roman" w:hAnsi="Times New Roman" w:cs="Times New Roman"/>
-          <w:b/>
-          <w:bCs/>
-          <w:sz w:val="24"/>
-          <w:szCs w:val="24"/>
-          <w:u w:val="single"/>
+          <w:sz w:val="24"/>
+          <w:szCs w:val="24"/>
         </w:rPr>
       </w:pPr>
     </w:p>
@@ -3779,21 +3687,15 @@
         <w:jc w:val="both"/>
         <w:rPr>
           <w:rFonts w:ascii="Times New Roman" w:hAnsi="Times New Roman" w:cs="Times New Roman"/>
-          <w:b/>
-          <w:bCs/>
-          <w:sz w:val="24"/>
-          <w:szCs w:val="24"/>
-          <w:u w:val="single"/>
-        </w:rPr>
-      </w:pPr>
-      <w:r>
-        <w:rPr>
-          <w:rFonts w:ascii="Times New Roman" w:hAnsi="Times New Roman" w:cs="Times New Roman"/>
-          <w:b/>
-          <w:bCs/>
-          <w:sz w:val="24"/>
-          <w:szCs w:val="24"/>
-          <w:u w:val="single"/>
+          <w:sz w:val="24"/>
+          <w:szCs w:val="24"/>
+        </w:rPr>
+      </w:pPr>
+      <w:r>
+        <w:rPr>
+          <w:rFonts w:ascii="Times New Roman" w:hAnsi="Times New Roman" w:cs="Times New Roman"/>
+          <w:sz w:val="24"/>
+          <w:szCs w:val="24"/>
         </w:rPr>
         <w:t>        //</w:t>
       </w:r>
@@ -3801,11 +3703,8 @@
       <w:r>
         <w:rPr>
           <w:rFonts w:ascii="Times New Roman" w:hAnsi="Times New Roman" w:cs="Times New Roman"/>
-          <w:b/>
-          <w:bCs/>
-          <w:sz w:val="24"/>
-          <w:szCs w:val="24"/>
-          <w:u w:val="single"/>
+          <w:sz w:val="24"/>
+          <w:szCs w:val="24"/>
         </w:rPr>
         <w:t>populate Linked</w:t>
       </w:r>
@@ -3813,11 +3712,8 @@
       <w:r>
         <w:rPr>
           <w:rFonts w:ascii="Times New Roman" w:hAnsi="Times New Roman" w:cs="Times New Roman"/>
-          <w:b/>
-          <w:bCs/>
-          <w:sz w:val="24"/>
-          <w:szCs w:val="24"/>
-          <w:u w:val="single"/>
+          <w:sz w:val="24"/>
+          <w:szCs w:val="24"/>
         </w:rPr>
         <w:t xml:space="preserve"> List</w:t>
       </w:r>
@@ -3832,21 +3728,15 @@
         <w:jc w:val="both"/>
         <w:rPr>
           <w:rFonts w:ascii="Times New Roman" w:hAnsi="Times New Roman" w:cs="Times New Roman"/>
-          <w:b/>
-          <w:bCs/>
-          <w:sz w:val="24"/>
-          <w:szCs w:val="24"/>
-          <w:u w:val="single"/>
-        </w:rPr>
-      </w:pPr>
-      <w:r>
-        <w:rPr>
-          <w:rFonts w:ascii="Times New Roman" w:hAnsi="Times New Roman" w:cs="Times New Roman"/>
-          <w:b/>
-          <w:bCs/>
-          <w:sz w:val="24"/>
-          <w:szCs w:val="24"/>
-          <w:u w:val="single"/>
+          <w:sz w:val="24"/>
+          <w:szCs w:val="24"/>
+        </w:rPr>
+      </w:pPr>
+      <w:r>
+        <w:rPr>
+          <w:rFonts w:ascii="Times New Roman" w:hAnsi="Times New Roman" w:cs="Times New Roman"/>
+          <w:sz w:val="24"/>
+          <w:szCs w:val="24"/>
         </w:rPr>
         <w:t xml:space="preserve">        </w:t>
       </w:r>
@@ -3854,11 +3744,8 @@
       <w:r>
         <w:rPr>
           <w:rFonts w:ascii="Times New Roman" w:hAnsi="Times New Roman" w:cs="Times New Roman"/>
-          <w:b/>
-          <w:bCs/>
-          <w:sz w:val="24"/>
-          <w:szCs w:val="24"/>
-          <w:u w:val="single"/>
+          <w:sz w:val="24"/>
+          <w:szCs w:val="24"/>
         </w:rPr>
         <w:t>lst.add</w:t>
       </w:r>
@@ -3866,11 +3753,8 @@
       <w:r>
         <w:rPr>
           <w:rFonts w:ascii="Times New Roman" w:hAnsi="Times New Roman" w:cs="Times New Roman"/>
-          <w:b/>
-          <w:bCs/>
-          <w:sz w:val="24"/>
-          <w:szCs w:val="24"/>
-          <w:u w:val="single"/>
+          <w:sz w:val="24"/>
+          <w:szCs w:val="24"/>
         </w:rPr>
         <w:t>("Papaya"</w:t>
       </w:r>
@@ -3878,11 +3762,8 @@
       <w:r>
         <w:rPr>
           <w:rFonts w:ascii="Times New Roman" w:hAnsi="Times New Roman" w:cs="Times New Roman"/>
-          <w:b/>
-          <w:bCs/>
-          <w:sz w:val="24"/>
-          <w:szCs w:val="24"/>
-          <w:u w:val="single"/>
+          <w:sz w:val="24"/>
+          <w:szCs w:val="24"/>
         </w:rPr>
         <w:t>);</w:t>
       </w:r>
@@ -3898,21 +3779,15 @@
         <w:jc w:val="both"/>
         <w:rPr>
           <w:rFonts w:ascii="Times New Roman" w:hAnsi="Times New Roman" w:cs="Times New Roman"/>
-          <w:b/>
-          <w:bCs/>
-          <w:sz w:val="24"/>
-          <w:szCs w:val="24"/>
-          <w:u w:val="single"/>
-        </w:rPr>
-      </w:pPr>
-      <w:r>
-        <w:rPr>
-          <w:rFonts w:ascii="Times New Roman" w:hAnsi="Times New Roman" w:cs="Times New Roman"/>
-          <w:b/>
-          <w:bCs/>
-          <w:sz w:val="24"/>
-          <w:szCs w:val="24"/>
-          <w:u w:val="single"/>
+          <w:sz w:val="24"/>
+          <w:szCs w:val="24"/>
+        </w:rPr>
+      </w:pPr>
+      <w:r>
+        <w:rPr>
+          <w:rFonts w:ascii="Times New Roman" w:hAnsi="Times New Roman" w:cs="Times New Roman"/>
+          <w:sz w:val="24"/>
+          <w:szCs w:val="24"/>
         </w:rPr>
         <w:t xml:space="preserve">        </w:t>
       </w:r>
@@ -3920,11 +3795,8 @@
       <w:r>
         <w:rPr>
           <w:rFonts w:ascii="Times New Roman" w:hAnsi="Times New Roman" w:cs="Times New Roman"/>
-          <w:b/>
-          <w:bCs/>
-          <w:sz w:val="24"/>
-          <w:szCs w:val="24"/>
-          <w:u w:val="single"/>
+          <w:sz w:val="24"/>
+          <w:szCs w:val="24"/>
         </w:rPr>
         <w:t>lst.add</w:t>
       </w:r>
@@ -3932,11 +3804,8 @@
       <w:r>
         <w:rPr>
           <w:rFonts w:ascii="Times New Roman" w:hAnsi="Times New Roman" w:cs="Times New Roman"/>
-          <w:b/>
-          <w:bCs/>
-          <w:sz w:val="24"/>
-          <w:szCs w:val="24"/>
-          <w:u w:val="single"/>
+          <w:sz w:val="24"/>
+          <w:szCs w:val="24"/>
         </w:rPr>
         <w:t>("Mulberry"</w:t>
       </w:r>
@@ -3944,11 +3813,8 @@
       <w:r>
         <w:rPr>
           <w:rFonts w:ascii="Times New Roman" w:hAnsi="Times New Roman" w:cs="Times New Roman"/>
-          <w:b/>
-          <w:bCs/>
-          <w:sz w:val="24"/>
-          <w:szCs w:val="24"/>
-          <w:u w:val="single"/>
+          <w:sz w:val="24"/>
+          <w:szCs w:val="24"/>
         </w:rPr>
         <w:t>);</w:t>
       </w:r>
@@ -3964,21 +3830,15 @@
         <w:jc w:val="both"/>
         <w:rPr>
           <w:rFonts w:ascii="Times New Roman" w:hAnsi="Times New Roman" w:cs="Times New Roman"/>
-          <w:b/>
-          <w:bCs/>
-          <w:sz w:val="24"/>
-          <w:szCs w:val="24"/>
-          <w:u w:val="single"/>
-        </w:rPr>
-      </w:pPr>
-      <w:r>
-        <w:rPr>
-          <w:rFonts w:ascii="Times New Roman" w:hAnsi="Times New Roman" w:cs="Times New Roman"/>
-          <w:b/>
-          <w:bCs/>
-          <w:sz w:val="24"/>
-          <w:szCs w:val="24"/>
-          <w:u w:val="single"/>
+          <w:sz w:val="24"/>
+          <w:szCs w:val="24"/>
+        </w:rPr>
+      </w:pPr>
+      <w:r>
+        <w:rPr>
+          <w:rFonts w:ascii="Times New Roman" w:hAnsi="Times New Roman" w:cs="Times New Roman"/>
+          <w:sz w:val="24"/>
+          <w:szCs w:val="24"/>
         </w:rPr>
         <w:t xml:space="preserve">        </w:t>
       </w:r>
@@ -3986,11 +3846,8 @@
       <w:r>
         <w:rPr>
           <w:rFonts w:ascii="Times New Roman" w:hAnsi="Times New Roman" w:cs="Times New Roman"/>
-          <w:b/>
-          <w:bCs/>
-          <w:sz w:val="24"/>
-          <w:szCs w:val="24"/>
-          <w:u w:val="single"/>
+          <w:sz w:val="24"/>
+          <w:szCs w:val="24"/>
         </w:rPr>
         <w:t>lst.add</w:t>
       </w:r>
@@ -3998,11 +3855,8 @@
       <w:r>
         <w:rPr>
           <w:rFonts w:ascii="Times New Roman" w:hAnsi="Times New Roman" w:cs="Times New Roman"/>
-          <w:b/>
-          <w:bCs/>
-          <w:sz w:val="24"/>
-          <w:szCs w:val="24"/>
-          <w:u w:val="single"/>
+          <w:sz w:val="24"/>
+          <w:szCs w:val="24"/>
         </w:rPr>
         <w:t>("Apple"</w:t>
       </w:r>
@@ -4010,11 +3864,8 @@
       <w:r>
         <w:rPr>
           <w:rFonts w:ascii="Times New Roman" w:hAnsi="Times New Roman" w:cs="Times New Roman"/>
-          <w:b/>
-          <w:bCs/>
-          <w:sz w:val="24"/>
-          <w:szCs w:val="24"/>
-          <w:u w:val="single"/>
+          <w:sz w:val="24"/>
+          <w:szCs w:val="24"/>
         </w:rPr>
         <w:t>);</w:t>
       </w:r>
@@ -4030,32 +3881,23 @@
         <w:jc w:val="both"/>
         <w:rPr>
           <w:rFonts w:ascii="Times New Roman" w:hAnsi="Times New Roman" w:cs="Times New Roman"/>
-          <w:b/>
-          <w:bCs/>
-          <w:sz w:val="24"/>
-          <w:szCs w:val="24"/>
-          <w:u w:val="single"/>
-        </w:rPr>
-      </w:pPr>
-      <w:r>
-        <w:rPr>
-          <w:rFonts w:ascii="Times New Roman" w:hAnsi="Times New Roman" w:cs="Times New Roman"/>
-          <w:b/>
-          <w:bCs/>
-          <w:sz w:val="24"/>
-          <w:szCs w:val="24"/>
-          <w:u w:val="single"/>
+          <w:sz w:val="24"/>
+          <w:szCs w:val="24"/>
+        </w:rPr>
+      </w:pPr>
+      <w:r>
+        <w:rPr>
+          <w:rFonts w:ascii="Times New Roman" w:hAnsi="Times New Roman" w:cs="Times New Roman"/>
+          <w:sz w:val="24"/>
+          <w:szCs w:val="24"/>
         </w:rPr>
         <w:t xml:space="preserve">        </w:t>
       </w:r>
       <w:r>
         <w:rPr>
           <w:rFonts w:ascii="Times New Roman" w:hAnsi="Times New Roman" w:cs="Times New Roman"/>
-          <w:b/>
-          <w:bCs/>
-          <w:sz w:val="24"/>
-          <w:szCs w:val="24"/>
-          <w:u w:val="single"/>
+          <w:sz w:val="24"/>
+          <w:szCs w:val="24"/>
         </w:rPr>
         <w:t>//</w:t>
       </w:r>
@@ -4063,11 +3905,8 @@
       <w:r>
         <w:rPr>
           <w:rFonts w:ascii="Times New Roman" w:hAnsi="Times New Roman" w:cs="Times New Roman"/>
-          <w:b/>
-          <w:bCs/>
-          <w:sz w:val="24"/>
-          <w:szCs w:val="24"/>
-          <w:u w:val="single"/>
+          <w:sz w:val="24"/>
+          <w:szCs w:val="24"/>
         </w:rPr>
         <w:t>lst.add</w:t>
       </w:r>
@@ -4075,11 +3914,8 @@
       <w:r>
         <w:rPr>
           <w:rFonts w:ascii="Times New Roman" w:hAnsi="Times New Roman" w:cs="Times New Roman"/>
-          <w:b/>
-          <w:bCs/>
-          <w:sz w:val="24"/>
-          <w:szCs w:val="24"/>
-          <w:u w:val="single"/>
+          <w:sz w:val="24"/>
+          <w:szCs w:val="24"/>
         </w:rPr>
         <w:t>("Cherry"</w:t>
       </w:r>
@@ -4087,11 +3923,8 @@
       <w:r>
         <w:rPr>
           <w:rFonts w:ascii="Times New Roman" w:hAnsi="Times New Roman" w:cs="Times New Roman"/>
-          <w:b/>
-          <w:bCs/>
-          <w:sz w:val="24"/>
-          <w:szCs w:val="24"/>
-          <w:u w:val="single"/>
+          <w:sz w:val="24"/>
+          <w:szCs w:val="24"/>
         </w:rPr>
         <w:t>);</w:t>
       </w:r>
@@ -4107,34 +3940,32 @@
         <w:jc w:val="both"/>
         <w:rPr>
           <w:rFonts w:ascii="Times New Roman" w:hAnsi="Times New Roman" w:cs="Times New Roman"/>
-          <w:b/>
-          <w:bCs/>
-          <w:sz w:val="24"/>
-          <w:szCs w:val="24"/>
-          <w:u w:val="single"/>
-        </w:rPr>
-      </w:pPr>
-      <w:r>
-        <w:rPr>
-          <w:rFonts w:ascii="Times New Roman" w:hAnsi="Times New Roman" w:cs="Times New Roman"/>
-          <w:b/>
-          <w:bCs/>
-          <w:sz w:val="24"/>
-          <w:szCs w:val="24"/>
-          <w:u w:val="single"/>
-        </w:rPr>
-        <w:tab/>
+          <w:sz w:val="24"/>
+          <w:szCs w:val="24"/>
+        </w:rPr>
+      </w:pPr>
+      <w:r>
+        <w:rPr>
+          <w:rFonts w:ascii="Times New Roman" w:hAnsi="Times New Roman" w:cs="Times New Roman"/>
+          <w:sz w:val="24"/>
+          <w:szCs w:val="24"/>
+        </w:rPr>
+        <w:t xml:space="preserve">        </w:t>
+      </w:r>
+      <w:r>
+        <w:rPr>
+          <w:rFonts w:ascii="Times New Roman" w:hAnsi="Times New Roman" w:cs="Times New Roman"/>
+          <w:sz w:val="24"/>
+          <w:szCs w:val="24"/>
+        </w:rPr>
         <w:t>//</w:t>
       </w:r>
       <w:proofErr w:type="spellStart"/>
       <w:r>
         <w:rPr>
           <w:rFonts w:ascii="Times New Roman" w:hAnsi="Times New Roman" w:cs="Times New Roman"/>
-          <w:b/>
-          <w:bCs/>
-          <w:sz w:val="24"/>
-          <w:szCs w:val="24"/>
-          <w:u w:val="single"/>
+          <w:sz w:val="24"/>
+          <w:szCs w:val="24"/>
         </w:rPr>
         <w:t>lst.add</w:t>
       </w:r>
@@ -4142,23 +3973,17 @@
       <w:r>
         <w:rPr>
           <w:rFonts w:ascii="Times New Roman" w:hAnsi="Times New Roman" w:cs="Times New Roman"/>
-          <w:b/>
-          <w:bCs/>
-          <w:sz w:val="24"/>
-          <w:szCs w:val="24"/>
-          <w:u w:val="single"/>
-        </w:rPr>
-        <w:t>(“Guava”</w:t>
+          <w:sz w:val="24"/>
+          <w:szCs w:val="24"/>
+        </w:rPr>
+        <w:t>("Guava"</w:t>
       </w:r>
       <w:proofErr w:type="gramStart"/>
       <w:r>
         <w:rPr>
           <w:rFonts w:ascii="Times New Roman" w:hAnsi="Times New Roman" w:cs="Times New Roman"/>
-          <w:b/>
-          <w:bCs/>
-          <w:sz w:val="24"/>
-          <w:szCs w:val="24"/>
-          <w:u w:val="single"/>
+          <w:sz w:val="24"/>
+          <w:szCs w:val="24"/>
         </w:rPr>
         <w:t>);</w:t>
       </w:r>
@@ -4174,11 +3999,8 @@
         <w:jc w:val="both"/>
         <w:rPr>
           <w:rFonts w:ascii="Times New Roman" w:hAnsi="Times New Roman" w:cs="Times New Roman"/>
-          <w:b/>
-          <w:bCs/>
-          <w:sz w:val="24"/>
-          <w:szCs w:val="24"/>
-          <w:u w:val="single"/>
+          <w:sz w:val="24"/>
+          <w:szCs w:val="24"/>
         </w:rPr>
       </w:pPr>
     </w:p>
@@ -4192,21 +4014,15 @@
         <w:jc w:val="both"/>
         <w:rPr>
           <w:rFonts w:ascii="Times New Roman" w:hAnsi="Times New Roman" w:cs="Times New Roman"/>
-          <w:b/>
-          <w:bCs/>
-          <w:sz w:val="24"/>
-          <w:szCs w:val="24"/>
-          <w:u w:val="single"/>
-        </w:rPr>
-      </w:pPr>
-      <w:r>
-        <w:rPr>
-          <w:rFonts w:ascii="Times New Roman" w:hAnsi="Times New Roman" w:cs="Times New Roman"/>
-          <w:b/>
-          <w:bCs/>
-          <w:sz w:val="24"/>
-          <w:szCs w:val="24"/>
-          <w:u w:val="single"/>
+          <w:sz w:val="24"/>
+          <w:szCs w:val="24"/>
+        </w:rPr>
+      </w:pPr>
+      <w:r>
+        <w:rPr>
+          <w:rFonts w:ascii="Times New Roman" w:hAnsi="Times New Roman" w:cs="Times New Roman"/>
+          <w:sz w:val="24"/>
+          <w:szCs w:val="24"/>
         </w:rPr>
         <w:t>        //print contents of the populated Linked List</w:t>
       </w:r>
@@ -4221,21 +4037,15 @@
         <w:jc w:val="both"/>
         <w:rPr>
           <w:rFonts w:ascii="Times New Roman" w:hAnsi="Times New Roman" w:cs="Times New Roman"/>
-          <w:b/>
-          <w:bCs/>
-          <w:sz w:val="24"/>
-          <w:szCs w:val="24"/>
-          <w:u w:val="single"/>
-        </w:rPr>
-      </w:pPr>
-      <w:r>
-        <w:rPr>
-          <w:rFonts w:ascii="Times New Roman" w:hAnsi="Times New Roman" w:cs="Times New Roman"/>
-          <w:b/>
-          <w:bCs/>
-          <w:sz w:val="24"/>
-          <w:szCs w:val="24"/>
-          <w:u w:val="single"/>
+          <w:sz w:val="24"/>
+          <w:szCs w:val="24"/>
+        </w:rPr>
+      </w:pPr>
+      <w:r>
+        <w:rPr>
+          <w:rFonts w:ascii="Times New Roman" w:hAnsi="Times New Roman" w:cs="Times New Roman"/>
+          <w:sz w:val="24"/>
+          <w:szCs w:val="24"/>
         </w:rPr>
         <w:t xml:space="preserve">        </w:t>
       </w:r>
@@ -4243,11 +4053,8 @@
       <w:r>
         <w:rPr>
           <w:rFonts w:ascii="Times New Roman" w:hAnsi="Times New Roman" w:cs="Times New Roman"/>
-          <w:b/>
-          <w:bCs/>
-          <w:sz w:val="24"/>
-          <w:szCs w:val="24"/>
-          <w:u w:val="single"/>
+          <w:sz w:val="24"/>
+          <w:szCs w:val="24"/>
         </w:rPr>
         <w:t>System.out.println</w:t>
       </w:r>
@@ -4255,11 +4062,8 @@
       <w:r>
         <w:rPr>
           <w:rFonts w:ascii="Times New Roman" w:hAnsi="Times New Roman" w:cs="Times New Roman"/>
-          <w:b/>
-          <w:bCs/>
-          <w:sz w:val="24"/>
-          <w:szCs w:val="24"/>
-          <w:u w:val="single"/>
+          <w:sz w:val="24"/>
+          <w:szCs w:val="24"/>
         </w:rPr>
         <w:t xml:space="preserve">("Initial contents of the Linked List: " + </w:t>
       </w:r>
@@ -4267,11 +4071,8 @@
       <w:r>
         <w:rPr>
           <w:rFonts w:ascii="Times New Roman" w:hAnsi="Times New Roman" w:cs="Times New Roman"/>
-          <w:b/>
-          <w:bCs/>
-          <w:sz w:val="24"/>
-          <w:szCs w:val="24"/>
-          <w:u w:val="single"/>
+          <w:sz w:val="24"/>
+          <w:szCs w:val="24"/>
         </w:rPr>
         <w:t>lst</w:t>
       </w:r>
@@ -4280,11 +4081,8 @@
       <w:r>
         <w:rPr>
           <w:rFonts w:ascii="Times New Roman" w:hAnsi="Times New Roman" w:cs="Times New Roman"/>
-          <w:b/>
-          <w:bCs/>
-          <w:sz w:val="24"/>
-          <w:szCs w:val="24"/>
-          <w:u w:val="single"/>
+          <w:sz w:val="24"/>
+          <w:szCs w:val="24"/>
         </w:rPr>
         <w:t>);</w:t>
       </w:r>
@@ -4300,11 +4098,8 @@
         <w:jc w:val="both"/>
         <w:rPr>
           <w:rFonts w:ascii="Times New Roman" w:hAnsi="Times New Roman" w:cs="Times New Roman"/>
-          <w:b/>
-          <w:bCs/>
-          <w:sz w:val="24"/>
-          <w:szCs w:val="24"/>
-          <w:u w:val="single"/>
+          <w:sz w:val="24"/>
+          <w:szCs w:val="24"/>
         </w:rPr>
       </w:pPr>
     </w:p>
@@ -4318,23 +4113,17 @@
         <w:jc w:val="both"/>
         <w:rPr>
           <w:rFonts w:ascii="Times New Roman" w:hAnsi="Times New Roman" w:cs="Times New Roman"/>
-          <w:b/>
-          <w:bCs/>
-          <w:sz w:val="24"/>
-          <w:szCs w:val="24"/>
-          <w:u w:val="single"/>
-        </w:rPr>
-      </w:pPr>
-      <w:r>
-        <w:rPr>
-          <w:rFonts w:ascii="Times New Roman" w:hAnsi="Times New Roman" w:cs="Times New Roman"/>
-          <w:b/>
-          <w:bCs/>
-          <w:sz w:val="24"/>
-          <w:szCs w:val="24"/>
-          <w:u w:val="single"/>
-        </w:rPr>
-        <w:t>        //call and print check function on cherry</w:t>
+          <w:sz w:val="24"/>
+          <w:szCs w:val="24"/>
+        </w:rPr>
+      </w:pPr>
+      <w:r>
+        <w:rPr>
+          <w:rFonts w:ascii="Times New Roman" w:hAnsi="Times New Roman" w:cs="Times New Roman"/>
+          <w:sz w:val="24"/>
+          <w:szCs w:val="24"/>
+        </w:rPr>
+        <w:t>        //check if cherry is present</w:t>
       </w:r>
     </w:p>
     <w:p>
@@ -4347,96 +4136,46 @@
         <w:jc w:val="both"/>
         <w:rPr>
           <w:rFonts w:ascii="Times New Roman" w:hAnsi="Times New Roman" w:cs="Times New Roman"/>
-          <w:b/>
-          <w:bCs/>
-          <w:sz w:val="24"/>
-          <w:szCs w:val="24"/>
-          <w:u w:val="single"/>
-        </w:rPr>
-      </w:pPr>
-      <w:r>
-        <w:rPr>
-          <w:rFonts w:ascii="Times New Roman" w:hAnsi="Times New Roman" w:cs="Times New Roman"/>
-          <w:b/>
-          <w:bCs/>
-          <w:sz w:val="24"/>
-          <w:szCs w:val="24"/>
-          <w:u w:val="single"/>
-        </w:rPr>
-        <w:t xml:space="preserve">        </w:t>
+          <w:sz w:val="24"/>
+          <w:szCs w:val="24"/>
+        </w:rPr>
+      </w:pPr>
+      <w:r>
+        <w:rPr>
+          <w:rFonts w:ascii="Times New Roman" w:hAnsi="Times New Roman" w:cs="Times New Roman"/>
+          <w:sz w:val="24"/>
+          <w:szCs w:val="24"/>
+        </w:rPr>
+        <w:t>        if (</w:t>
       </w:r>
       <w:proofErr w:type="spellStart"/>
-      <w:r>
-        <w:rPr>
-          <w:rFonts w:ascii="Times New Roman" w:hAnsi="Times New Roman" w:cs="Times New Roman"/>
-          <w:b/>
-          <w:bCs/>
-          <w:sz w:val="24"/>
-          <w:szCs w:val="24"/>
-          <w:u w:val="single"/>
-        </w:rPr>
-        <w:t>System.out.println</w:t>
+      <w:proofErr w:type="gramStart"/>
+      <w:r>
+        <w:rPr>
+          <w:rFonts w:ascii="Times New Roman" w:hAnsi="Times New Roman" w:cs="Times New Roman"/>
+          <w:sz w:val="24"/>
+          <w:szCs w:val="24"/>
+        </w:rPr>
+        <w:t>lst.contains</w:t>
       </w:r>
       <w:proofErr w:type="spellEnd"/>
-      <w:r>
-        <w:rPr>
-          <w:rFonts w:ascii="Times New Roman" w:hAnsi="Times New Roman" w:cs="Times New Roman"/>
-          <w:b/>
-          <w:bCs/>
-          <w:sz w:val="24"/>
-          <w:szCs w:val="24"/>
-          <w:u w:val="single"/>
-        </w:rPr>
-        <w:t>(</w:t>
+      <w:proofErr w:type="gramEnd"/>
+      <w:r>
+        <w:rPr>
+          <w:rFonts w:ascii="Times New Roman" w:hAnsi="Times New Roman" w:cs="Times New Roman"/>
+          <w:sz w:val="24"/>
+          <w:szCs w:val="24"/>
+        </w:rPr>
+        <w:t>("Cherry"</w:t>
       </w:r>
       <w:proofErr w:type="gramStart"/>
       <w:r>
         <w:rPr>
           <w:rFonts w:ascii="Times New Roman" w:hAnsi="Times New Roman" w:cs="Times New Roman"/>
-          <w:b/>
-          <w:bCs/>
-          <w:sz w:val="24"/>
-          <w:szCs w:val="24"/>
-          <w:u w:val="single"/>
-        </w:rPr>
-        <w:t>Check(</w:t>
-      </w:r>
-      <w:proofErr w:type="spellStart"/>
-      <w:proofErr w:type="gramEnd"/>
-      <w:r>
-        <w:rPr>
-          <w:rFonts w:ascii="Times New Roman" w:hAnsi="Times New Roman" w:cs="Times New Roman"/>
-          <w:b/>
-          <w:bCs/>
-          <w:sz w:val="24"/>
-          <w:szCs w:val="24"/>
-          <w:u w:val="single"/>
-        </w:rPr>
-        <w:t>lst</w:t>
-      </w:r>
-      <w:proofErr w:type="spellEnd"/>
-      <w:r>
-        <w:rPr>
-          <w:rFonts w:ascii="Times New Roman" w:hAnsi="Times New Roman" w:cs="Times New Roman"/>
-          <w:b/>
-          <w:bCs/>
-          <w:sz w:val="24"/>
-          <w:szCs w:val="24"/>
-          <w:u w:val="single"/>
-        </w:rPr>
-        <w:t>, "Cherry")</w:t>
-      </w:r>
-      <w:proofErr w:type="gramStart"/>
-      <w:r>
-        <w:rPr>
-          <w:rFonts w:ascii="Times New Roman" w:hAnsi="Times New Roman" w:cs="Times New Roman"/>
-          <w:b/>
-          <w:bCs/>
-          <w:sz w:val="24"/>
-          <w:szCs w:val="24"/>
-          <w:u w:val="single"/>
-        </w:rPr>
-        <w:t>);</w:t>
+          <w:sz w:val="24"/>
+          <w:szCs w:val="24"/>
+        </w:rPr>
+        <w:t>)){</w:t>
       </w:r>
       <w:proofErr w:type="gramEnd"/>
     </w:p>
@@ -4450,24 +4189,46 @@
         <w:jc w:val="both"/>
         <w:rPr>
           <w:rFonts w:ascii="Times New Roman" w:hAnsi="Times New Roman" w:cs="Times New Roman"/>
-          <w:b/>
-          <w:bCs/>
-          <w:sz w:val="24"/>
-          <w:szCs w:val="24"/>
-          <w:u w:val="single"/>
-        </w:rPr>
-      </w:pPr>
-      <w:r>
-        <w:rPr>
-          <w:rFonts w:ascii="Times New Roman" w:hAnsi="Times New Roman" w:cs="Times New Roman"/>
-          <w:b/>
-          <w:bCs/>
-          <w:sz w:val="24"/>
-          <w:szCs w:val="24"/>
-          <w:u w:val="single"/>
-        </w:rPr>
-        <w:t xml:space="preserve">        </w:t>
-      </w:r>
+          <w:sz w:val="24"/>
+          <w:szCs w:val="24"/>
+        </w:rPr>
+      </w:pPr>
+      <w:r>
+        <w:rPr>
+          <w:rFonts w:ascii="Times New Roman" w:hAnsi="Times New Roman" w:cs="Times New Roman"/>
+          <w:sz w:val="24"/>
+          <w:szCs w:val="24"/>
+        </w:rPr>
+        <w:t xml:space="preserve">            </w:t>
+      </w:r>
+      <w:proofErr w:type="spellStart"/>
+      <w:r>
+        <w:rPr>
+          <w:rFonts w:ascii="Times New Roman" w:hAnsi="Times New Roman" w:cs="Times New Roman"/>
+          <w:sz w:val="24"/>
+          <w:szCs w:val="24"/>
+        </w:rPr>
+        <w:t>System.out.println</w:t>
+      </w:r>
+      <w:proofErr w:type="spellEnd"/>
+      <w:r>
+        <w:rPr>
+          <w:rFonts w:ascii="Times New Roman" w:hAnsi="Times New Roman" w:cs="Times New Roman"/>
+          <w:sz w:val="24"/>
+          <w:szCs w:val="24"/>
+        </w:rPr>
+        <w:t>("Fruit Cherry is present"</w:t>
+      </w:r>
+      <w:proofErr w:type="gramStart"/>
+      <w:r>
+        <w:rPr>
+          <w:rFonts w:ascii="Times New Roman" w:hAnsi="Times New Roman" w:cs="Times New Roman"/>
+          <w:sz w:val="24"/>
+          <w:szCs w:val="24"/>
+        </w:rPr>
+        <w:t>);</w:t>
+      </w:r>
+      <w:proofErr w:type="gramEnd"/>
     </w:p>
     <w:p>
       <w:pPr>
@@ -4479,23 +4240,35 @@
         <w:jc w:val="both"/>
         <w:rPr>
           <w:rFonts w:ascii="Times New Roman" w:hAnsi="Times New Roman" w:cs="Times New Roman"/>
-          <w:b/>
-          <w:bCs/>
-          <w:sz w:val="24"/>
-          <w:szCs w:val="24"/>
-          <w:u w:val="single"/>
-        </w:rPr>
-      </w:pPr>
-      <w:r>
-        <w:rPr>
-          <w:rFonts w:ascii="Times New Roman" w:hAnsi="Times New Roman" w:cs="Times New Roman"/>
-          <w:b/>
-          <w:bCs/>
-          <w:sz w:val="24"/>
-          <w:szCs w:val="24"/>
-          <w:u w:val="single"/>
-        </w:rPr>
-        <w:t>        //check function on guava</w:t>
+          <w:sz w:val="24"/>
+          <w:szCs w:val="24"/>
+        </w:rPr>
+      </w:pPr>
+      <w:r>
+        <w:rPr>
+          <w:rFonts w:ascii="Times New Roman" w:hAnsi="Times New Roman" w:cs="Times New Roman"/>
+          <w:sz w:val="24"/>
+          <w:szCs w:val="24"/>
+        </w:rPr>
+        <w:t xml:space="preserve">        </w:t>
+      </w:r>
+      <w:proofErr w:type="gramStart"/>
+      <w:r>
+        <w:rPr>
+          <w:rFonts w:ascii="Times New Roman" w:hAnsi="Times New Roman" w:cs="Times New Roman"/>
+          <w:sz w:val="24"/>
+          <w:szCs w:val="24"/>
+        </w:rPr>
+        <w:t>}else</w:t>
+      </w:r>
+      <w:proofErr w:type="gramEnd"/>
+      <w:r>
+        <w:rPr>
+          <w:rFonts w:ascii="Times New Roman" w:hAnsi="Times New Roman" w:cs="Times New Roman"/>
+          <w:sz w:val="24"/>
+          <w:szCs w:val="24"/>
+        </w:rPr>
+        <w:t>{</w:t>
       </w:r>
     </w:p>
     <w:p>
@@ -4508,33 +4281,24 @@
         <w:jc w:val="both"/>
         <w:rPr>
           <w:rFonts w:ascii="Times New Roman" w:hAnsi="Times New Roman" w:cs="Times New Roman"/>
-          <w:b/>
-          <w:bCs/>
-          <w:sz w:val="24"/>
-          <w:szCs w:val="24"/>
-          <w:u w:val="single"/>
-        </w:rPr>
-      </w:pPr>
-      <w:r>
-        <w:rPr>
-          <w:rFonts w:ascii="Times New Roman" w:hAnsi="Times New Roman" w:cs="Times New Roman"/>
-          <w:b/>
-          <w:bCs/>
-          <w:sz w:val="24"/>
-          <w:szCs w:val="24"/>
-          <w:u w:val="single"/>
-        </w:rPr>
-        <w:t xml:space="preserve">        </w:t>
+          <w:sz w:val="24"/>
+          <w:szCs w:val="24"/>
+        </w:rPr>
+      </w:pPr>
+      <w:r>
+        <w:rPr>
+          <w:rFonts w:ascii="Times New Roman" w:hAnsi="Times New Roman" w:cs="Times New Roman"/>
+          <w:sz w:val="24"/>
+          <w:szCs w:val="24"/>
+        </w:rPr>
+        <w:t xml:space="preserve">            </w:t>
       </w:r>
       <w:proofErr w:type="spellStart"/>
       <w:r>
         <w:rPr>
           <w:rFonts w:ascii="Times New Roman" w:hAnsi="Times New Roman" w:cs="Times New Roman"/>
-          <w:b/>
-          <w:bCs/>
-          <w:sz w:val="24"/>
-          <w:szCs w:val="24"/>
-          <w:u w:val="single"/>
+          <w:sz w:val="24"/>
+          <w:szCs w:val="24"/>
         </w:rPr>
         <w:t>System.out.println</w:t>
       </w:r>
@@ -4542,60 +4306,17 @@
       <w:r>
         <w:rPr>
           <w:rFonts w:ascii="Times New Roman" w:hAnsi="Times New Roman" w:cs="Times New Roman"/>
-          <w:b/>
-          <w:bCs/>
-          <w:sz w:val="24"/>
-          <w:szCs w:val="24"/>
-          <w:u w:val="single"/>
-        </w:rPr>
-        <w:t>(</w:t>
+          <w:sz w:val="24"/>
+          <w:szCs w:val="24"/>
+        </w:rPr>
+        <w:t>("Fruit Cherry is not present"</w:t>
       </w:r>
       <w:proofErr w:type="gramStart"/>
       <w:r>
         <w:rPr>
           <w:rFonts w:ascii="Times New Roman" w:hAnsi="Times New Roman" w:cs="Times New Roman"/>
-          <w:b/>
-          <w:bCs/>
-          <w:sz w:val="24"/>
-          <w:szCs w:val="24"/>
-          <w:u w:val="single"/>
-        </w:rPr>
-        <w:t>Check(</w:t>
-      </w:r>
-      <w:proofErr w:type="spellStart"/>
-      <w:proofErr w:type="gramEnd"/>
-      <w:r>
-        <w:rPr>
-          <w:rFonts w:ascii="Times New Roman" w:hAnsi="Times New Roman" w:cs="Times New Roman"/>
-          <w:b/>
-          <w:bCs/>
-          <w:sz w:val="24"/>
-          <w:szCs w:val="24"/>
-          <w:u w:val="single"/>
-        </w:rPr>
-        <w:t>lst</w:t>
-      </w:r>
-      <w:proofErr w:type="spellEnd"/>
-      <w:r>
-        <w:rPr>
-          <w:rFonts w:ascii="Times New Roman" w:hAnsi="Times New Roman" w:cs="Times New Roman"/>
-          <w:b/>
-          <w:bCs/>
-          <w:sz w:val="24"/>
-          <w:szCs w:val="24"/>
-          <w:u w:val="single"/>
-        </w:rPr>
-        <w:t>, "Guava")</w:t>
-      </w:r>
-      <w:proofErr w:type="gramStart"/>
-      <w:r>
-        <w:rPr>
-          <w:rFonts w:ascii="Times New Roman" w:hAnsi="Times New Roman" w:cs="Times New Roman"/>
-          <w:b/>
-          <w:bCs/>
-          <w:sz w:val="24"/>
-          <w:szCs w:val="24"/>
-          <w:u w:val="single"/>
+          <w:sz w:val="24"/>
+          <w:szCs w:val="24"/>
         </w:rPr>
         <w:t>);</w:t>
       </w:r>
@@ -4611,24 +4332,18 @@
         <w:jc w:val="both"/>
         <w:rPr>
           <w:rFonts w:ascii="Times New Roman" w:hAnsi="Times New Roman" w:cs="Times New Roman"/>
-          <w:b/>
-          <w:bCs/>
-          <w:sz w:val="24"/>
-          <w:szCs w:val="24"/>
-          <w:u w:val="single"/>
-        </w:rPr>
-      </w:pPr>
-      <w:r>
-        <w:rPr>
-          <w:rFonts w:ascii="Times New Roman" w:hAnsi="Times New Roman" w:cs="Times New Roman"/>
-          <w:b/>
-          <w:bCs/>
-          <w:sz w:val="24"/>
-          <w:szCs w:val="24"/>
-          <w:u w:val="single"/>
+          <w:sz w:val="24"/>
+          <w:szCs w:val="24"/>
+        </w:rPr>
+      </w:pPr>
+      <w:r>
+        <w:rPr>
+          <w:rFonts w:ascii="Times New Roman" w:hAnsi="Times New Roman" w:cs="Times New Roman"/>
+          <w:sz w:val="24"/>
+          <w:szCs w:val="24"/>
         </w:rPr>
         <w:lastRenderedPageBreak/>
-        <w:t>    }</w:t>
+        <w:t>        }</w:t>
       </w:r>
     </w:p>
     <w:p>
@@ -4641,13 +4356,18 @@
         <w:jc w:val="both"/>
         <w:rPr>
           <w:rFonts w:ascii="Times New Roman" w:hAnsi="Times New Roman" w:cs="Times New Roman"/>
-          <w:b/>
-          <w:bCs/>
-          <w:sz w:val="24"/>
-          <w:szCs w:val="24"/>
-          <w:u w:val="single"/>
-        </w:rPr>
-      </w:pPr>
+          <w:sz w:val="24"/>
+          <w:szCs w:val="24"/>
+        </w:rPr>
+      </w:pPr>
+      <w:r>
+        <w:rPr>
+          <w:rFonts w:ascii="Times New Roman" w:hAnsi="Times New Roman" w:cs="Times New Roman"/>
+          <w:sz w:val="24"/>
+          <w:szCs w:val="24"/>
+        </w:rPr>
+        <w:t xml:space="preserve">        </w:t>
+      </w:r>
     </w:p>
     <w:p>
       <w:pPr>
@@ -4659,23 +4379,35 @@
         <w:jc w:val="both"/>
         <w:rPr>
           <w:rFonts w:ascii="Times New Roman" w:hAnsi="Times New Roman" w:cs="Times New Roman"/>
-          <w:b/>
-          <w:bCs/>
-          <w:sz w:val="24"/>
-          <w:szCs w:val="24"/>
-          <w:u w:val="single"/>
-        </w:rPr>
-      </w:pPr>
-      <w:r>
-        <w:rPr>
-          <w:rFonts w:ascii="Times New Roman" w:hAnsi="Times New Roman" w:cs="Times New Roman"/>
-          <w:b/>
-          <w:bCs/>
-          <w:sz w:val="24"/>
-          <w:szCs w:val="24"/>
-          <w:u w:val="single"/>
-        </w:rPr>
-        <w:t>    //create check function</w:t>
+          <w:sz w:val="24"/>
+          <w:szCs w:val="24"/>
+        </w:rPr>
+      </w:pPr>
+      <w:r>
+        <w:rPr>
+          <w:rFonts w:ascii="Times New Roman" w:hAnsi="Times New Roman" w:cs="Times New Roman"/>
+          <w:sz w:val="24"/>
+          <w:szCs w:val="24"/>
+        </w:rPr>
+        <w:t xml:space="preserve">        //check if </w:t>
+      </w:r>
+      <w:proofErr w:type="gramStart"/>
+      <w:r>
+        <w:rPr>
+          <w:rFonts w:ascii="Times New Roman" w:hAnsi="Times New Roman" w:cs="Times New Roman"/>
+          <w:sz w:val="24"/>
+          <w:szCs w:val="24"/>
+        </w:rPr>
+        <w:t>guava</w:t>
+      </w:r>
+      <w:proofErr w:type="gramEnd"/>
+      <w:r>
+        <w:rPr>
+          <w:rFonts w:ascii="Times New Roman" w:hAnsi="Times New Roman" w:cs="Times New Roman"/>
+          <w:sz w:val="24"/>
+          <w:szCs w:val="24"/>
+        </w:rPr>
+        <w:t xml:space="preserve"> is present</w:t>
       </w:r>
     </w:p>
     <w:p>
@@ -4688,24 +4420,48 @@
         <w:jc w:val="both"/>
         <w:rPr>
           <w:rFonts w:ascii="Times New Roman" w:hAnsi="Times New Roman" w:cs="Times New Roman"/>
-          <w:b/>
-          <w:bCs/>
-          <w:sz w:val="24"/>
-          <w:szCs w:val="24"/>
-          <w:u w:val="single"/>
-        </w:rPr>
-      </w:pPr>
-      <w:r>
-        <w:rPr>
-          <w:rFonts w:ascii="Times New Roman" w:hAnsi="Times New Roman" w:cs="Times New Roman"/>
-          <w:b/>
-          <w:bCs/>
-          <w:sz w:val="24"/>
-          <w:szCs w:val="24"/>
-          <w:u w:val="single"/>
-        </w:rPr>
-        <w:t>    /**</w:t>
-      </w:r>
+          <w:sz w:val="24"/>
+          <w:szCs w:val="24"/>
+        </w:rPr>
+      </w:pPr>
+      <w:r>
+        <w:rPr>
+          <w:rFonts w:ascii="Times New Roman" w:hAnsi="Times New Roman" w:cs="Times New Roman"/>
+          <w:sz w:val="24"/>
+          <w:szCs w:val="24"/>
+        </w:rPr>
+        <w:t>        if (</w:t>
+      </w:r>
+      <w:proofErr w:type="spellStart"/>
+      <w:proofErr w:type="gramStart"/>
+      <w:r>
+        <w:rPr>
+          <w:rFonts w:ascii="Times New Roman" w:hAnsi="Times New Roman" w:cs="Times New Roman"/>
+          <w:sz w:val="24"/>
+          <w:szCs w:val="24"/>
+        </w:rPr>
+        <w:t>lst.contains</w:t>
+      </w:r>
+      <w:proofErr w:type="spellEnd"/>
+      <w:proofErr w:type="gramEnd"/>
+      <w:r>
+        <w:rPr>
+          <w:rFonts w:ascii="Times New Roman" w:hAnsi="Times New Roman" w:cs="Times New Roman"/>
+          <w:sz w:val="24"/>
+          <w:szCs w:val="24"/>
+        </w:rPr>
+        <w:t>("Guava"</w:t>
+      </w:r>
+      <w:proofErr w:type="gramStart"/>
+      <w:r>
+        <w:rPr>
+          <w:rFonts w:ascii="Times New Roman" w:hAnsi="Times New Roman" w:cs="Times New Roman"/>
+          <w:sz w:val="24"/>
+          <w:szCs w:val="24"/>
+        </w:rPr>
+        <w:t>)){</w:t>
+      </w:r>
+      <w:proofErr w:type="gramEnd"/>
     </w:p>
     <w:p>
       <w:pPr>
@@ -4717,24 +4473,46 @@
         <w:jc w:val="both"/>
         <w:rPr>
           <w:rFonts w:ascii="Times New Roman" w:hAnsi="Times New Roman" w:cs="Times New Roman"/>
-          <w:b/>
-          <w:bCs/>
-          <w:sz w:val="24"/>
-          <w:szCs w:val="24"/>
-          <w:u w:val="single"/>
-        </w:rPr>
-      </w:pPr>
-      <w:r>
-        <w:rPr>
-          <w:rFonts w:ascii="Times New Roman" w:hAnsi="Times New Roman" w:cs="Times New Roman"/>
-          <w:b/>
-          <w:bCs/>
-          <w:sz w:val="24"/>
-          <w:szCs w:val="24"/>
-          <w:u w:val="single"/>
-        </w:rPr>
-        <w:t>     * Function Name: Check</w:t>
-      </w:r>
+          <w:sz w:val="24"/>
+          <w:szCs w:val="24"/>
+        </w:rPr>
+      </w:pPr>
+      <w:r>
+        <w:rPr>
+          <w:rFonts w:ascii="Times New Roman" w:hAnsi="Times New Roman" w:cs="Times New Roman"/>
+          <w:sz w:val="24"/>
+          <w:szCs w:val="24"/>
+        </w:rPr>
+        <w:t xml:space="preserve">            </w:t>
+      </w:r>
+      <w:proofErr w:type="spellStart"/>
+      <w:r>
+        <w:rPr>
+          <w:rFonts w:ascii="Times New Roman" w:hAnsi="Times New Roman" w:cs="Times New Roman"/>
+          <w:sz w:val="24"/>
+          <w:szCs w:val="24"/>
+        </w:rPr>
+        <w:t>System.out.println</w:t>
+      </w:r>
+      <w:proofErr w:type="spellEnd"/>
+      <w:r>
+        <w:rPr>
+          <w:rFonts w:ascii="Times New Roman" w:hAnsi="Times New Roman" w:cs="Times New Roman"/>
+          <w:sz w:val="24"/>
+          <w:szCs w:val="24"/>
+        </w:rPr>
+        <w:t>("Fruit Guava is present"</w:t>
+      </w:r>
+      <w:proofErr w:type="gramStart"/>
+      <w:r>
+        <w:rPr>
+          <w:rFonts w:ascii="Times New Roman" w:hAnsi="Times New Roman" w:cs="Times New Roman"/>
+          <w:sz w:val="24"/>
+          <w:szCs w:val="24"/>
+        </w:rPr>
+        <w:t>);</w:t>
+      </w:r>
+      <w:proofErr w:type="gramEnd"/>
     </w:p>
     <w:p>
       <w:pPr>
@@ -4746,23 +4524,35 @@
         <w:jc w:val="both"/>
         <w:rPr>
           <w:rFonts w:ascii="Times New Roman" w:hAnsi="Times New Roman" w:cs="Times New Roman"/>
-          <w:b/>
-          <w:bCs/>
-          <w:sz w:val="24"/>
-          <w:szCs w:val="24"/>
-          <w:u w:val="single"/>
-        </w:rPr>
-      </w:pPr>
-      <w:r>
-        <w:rPr>
-          <w:rFonts w:ascii="Times New Roman" w:hAnsi="Times New Roman" w:cs="Times New Roman"/>
-          <w:b/>
-          <w:bCs/>
-          <w:sz w:val="24"/>
-          <w:szCs w:val="24"/>
-          <w:u w:val="single"/>
-        </w:rPr>
-        <w:t xml:space="preserve">     * </w:t>
+          <w:sz w:val="24"/>
+          <w:szCs w:val="24"/>
+        </w:rPr>
+      </w:pPr>
+      <w:r>
+        <w:rPr>
+          <w:rFonts w:ascii="Times New Roman" w:hAnsi="Times New Roman" w:cs="Times New Roman"/>
+          <w:sz w:val="24"/>
+          <w:szCs w:val="24"/>
+        </w:rPr>
+        <w:t xml:space="preserve">        </w:t>
+      </w:r>
+      <w:proofErr w:type="gramStart"/>
+      <w:r>
+        <w:rPr>
+          <w:rFonts w:ascii="Times New Roman" w:hAnsi="Times New Roman" w:cs="Times New Roman"/>
+          <w:sz w:val="24"/>
+          <w:szCs w:val="24"/>
+        </w:rPr>
+        <w:t>}else</w:t>
+      </w:r>
+      <w:proofErr w:type="gramEnd"/>
+      <w:r>
+        <w:rPr>
+          <w:rFonts w:ascii="Times New Roman" w:hAnsi="Times New Roman" w:cs="Times New Roman"/>
+          <w:sz w:val="24"/>
+          <w:szCs w:val="24"/>
+        </w:rPr>
+        <w:t>{</w:t>
       </w:r>
     </w:p>
     <w:p>
@@ -4775,37 +4565,46 @@
         <w:jc w:val="both"/>
         <w:rPr>
           <w:rFonts w:ascii="Times New Roman" w:hAnsi="Times New Roman" w:cs="Times New Roman"/>
-          <w:b/>
-          <w:bCs/>
-          <w:sz w:val="24"/>
-          <w:szCs w:val="24"/>
-          <w:u w:val="single"/>
-        </w:rPr>
-      </w:pPr>
-      <w:r>
-        <w:rPr>
-          <w:rFonts w:ascii="Times New Roman" w:hAnsi="Times New Roman" w:cs="Times New Roman"/>
-          <w:b/>
-          <w:bCs/>
-          <w:sz w:val="24"/>
-          <w:szCs w:val="24"/>
-          <w:u w:val="single"/>
-        </w:rPr>
-        <w:t xml:space="preserve">     * @param </w:t>
+          <w:sz w:val="24"/>
+          <w:szCs w:val="24"/>
+        </w:rPr>
+      </w:pPr>
+      <w:r>
+        <w:rPr>
+          <w:rFonts w:ascii="Times New Roman" w:hAnsi="Times New Roman" w:cs="Times New Roman"/>
+          <w:sz w:val="24"/>
+          <w:szCs w:val="24"/>
+        </w:rPr>
+        <w:t xml:space="preserve">            </w:t>
       </w:r>
       <w:proofErr w:type="spellStart"/>
       <w:r>
         <w:rPr>
           <w:rFonts w:ascii="Times New Roman" w:hAnsi="Times New Roman" w:cs="Times New Roman"/>
-          <w:b/>
-          <w:bCs/>
-          <w:sz w:val="24"/>
-          <w:szCs w:val="24"/>
-          <w:u w:val="single"/>
-        </w:rPr>
-        <w:t>linkedList</w:t>
+          <w:sz w:val="24"/>
+          <w:szCs w:val="24"/>
+        </w:rPr>
+        <w:t>System.out.println</w:t>
       </w:r>
       <w:proofErr w:type="spellEnd"/>
+      <w:r>
+        <w:rPr>
+          <w:rFonts w:ascii="Times New Roman" w:hAnsi="Times New Roman" w:cs="Times New Roman"/>
+          <w:sz w:val="24"/>
+          <w:szCs w:val="24"/>
+        </w:rPr>
+        <w:t>("Fruit Guava is not present"</w:t>
+      </w:r>
+      <w:proofErr w:type="gramStart"/>
+      <w:r>
+        <w:rPr>
+          <w:rFonts w:ascii="Times New Roman" w:hAnsi="Times New Roman" w:cs="Times New Roman"/>
+          <w:sz w:val="24"/>
+          <w:szCs w:val="24"/>
+        </w:rPr>
+        <w:t>);</w:t>
+      </w:r>
+      <w:proofErr w:type="gramEnd"/>
     </w:p>
     <w:p>
       <w:pPr>
@@ -4817,23 +4616,17 @@
         <w:jc w:val="both"/>
         <w:rPr>
           <w:rFonts w:ascii="Times New Roman" w:hAnsi="Times New Roman" w:cs="Times New Roman"/>
-          <w:b/>
-          <w:bCs/>
-          <w:sz w:val="24"/>
-          <w:szCs w:val="24"/>
-          <w:u w:val="single"/>
-        </w:rPr>
-      </w:pPr>
-      <w:r>
-        <w:rPr>
-          <w:rFonts w:ascii="Times New Roman" w:hAnsi="Times New Roman" w:cs="Times New Roman"/>
-          <w:b/>
-          <w:bCs/>
-          <w:sz w:val="24"/>
-          <w:szCs w:val="24"/>
-          <w:u w:val="single"/>
-        </w:rPr>
-        <w:t>     * @param item</w:t>
+          <w:sz w:val="24"/>
+          <w:szCs w:val="24"/>
+        </w:rPr>
+      </w:pPr>
+      <w:r>
+        <w:rPr>
+          <w:rFonts w:ascii="Times New Roman" w:hAnsi="Times New Roman" w:cs="Times New Roman"/>
+          <w:sz w:val="24"/>
+          <w:szCs w:val="24"/>
+        </w:rPr>
+        <w:t>    }</w:t>
       </w:r>
     </w:p>
     <w:p>
@@ -4846,24 +4639,10 @@
         <w:jc w:val="both"/>
         <w:rPr>
           <w:rFonts w:ascii="Times New Roman" w:hAnsi="Times New Roman" w:cs="Times New Roman"/>
-          <w:b/>
-          <w:bCs/>
-          <w:sz w:val="24"/>
-          <w:szCs w:val="24"/>
-          <w:u w:val="single"/>
-        </w:rPr>
-      </w:pPr>
-      <w:r>
-        <w:rPr>
-          <w:rFonts w:ascii="Times New Roman" w:hAnsi="Times New Roman" w:cs="Times New Roman"/>
-          <w:b/>
-          <w:bCs/>
-          <w:sz w:val="24"/>
-          <w:szCs w:val="24"/>
-          <w:u w:val="single"/>
-        </w:rPr>
-        <w:t>     * @return</w:t>
-      </w:r>
+          <w:sz w:val="24"/>
+          <w:szCs w:val="24"/>
+        </w:rPr>
+      </w:pPr>
     </w:p>
     <w:p>
       <w:pPr>
@@ -4875,23 +4654,17 @@
         <w:jc w:val="both"/>
         <w:rPr>
           <w:rFonts w:ascii="Times New Roman" w:hAnsi="Times New Roman" w:cs="Times New Roman"/>
-          <w:b/>
-          <w:bCs/>
-          <w:sz w:val="24"/>
-          <w:szCs w:val="24"/>
-          <w:u w:val="single"/>
-        </w:rPr>
-      </w:pPr>
-      <w:r>
-        <w:rPr>
-          <w:rFonts w:ascii="Times New Roman" w:hAnsi="Times New Roman" w:cs="Times New Roman"/>
-          <w:b/>
-          <w:bCs/>
-          <w:sz w:val="24"/>
-          <w:szCs w:val="24"/>
-          <w:u w:val="single"/>
-        </w:rPr>
-        <w:t xml:space="preserve">     * </w:t>
+          <w:sz w:val="24"/>
+          <w:szCs w:val="24"/>
+        </w:rPr>
+      </w:pPr>
+      <w:r>
+        <w:rPr>
+          <w:rFonts w:ascii="Times New Roman" w:hAnsi="Times New Roman" w:cs="Times New Roman"/>
+          <w:sz w:val="24"/>
+          <w:szCs w:val="24"/>
+        </w:rPr>
+        <w:t>    }</w:t>
       </w:r>
     </w:p>
     <w:p>
@@ -4914,13 +4687,10 @@
       <w:r>
         <w:rPr>
           <w:rFonts w:ascii="Times New Roman" w:hAnsi="Times New Roman" w:cs="Times New Roman"/>
-          <w:b/>
-          <w:bCs/>
-          <w:sz w:val="24"/>
-          <w:szCs w:val="24"/>
-          <w:u w:val="single"/>
-        </w:rPr>
-        <w:t>     * In this Function:</w:t>
+          <w:sz w:val="24"/>
+          <w:szCs w:val="24"/>
+        </w:rPr>
+        <w:t>}</w:t>
       </w:r>
     </w:p>
     <w:p>
@@ -4940,17 +4710,6 @@
           <w:u w:val="single"/>
         </w:rPr>
       </w:pPr>
-      <w:r>
-        <w:rPr>
-          <w:rFonts w:ascii="Times New Roman" w:hAnsi="Times New Roman" w:cs="Times New Roman"/>
-          <w:b/>
-          <w:bCs/>
-          <w:sz w:val="24"/>
-          <w:szCs w:val="24"/>
-          <w:u w:val="single"/>
-        </w:rPr>
-        <w:t>     * 1. take input of a linked list and a string to see if it is in the linked list</w:t>
-      </w:r>
     </w:p>
     <w:p>
       <w:pPr>
@@ -4978,44 +4737,7 @@
           <w:szCs w:val="24"/>
           <w:u w:val="single"/>
         </w:rPr>
-        <w:t xml:space="preserve">     * 2. while loop the ends if it reaches the tail </w:t>
-      </w:r>
-      <w:proofErr w:type="gramStart"/>
-      <w:r>
-        <w:rPr>
-          <w:rFonts w:ascii="Times New Roman" w:hAnsi="Times New Roman" w:cs="Times New Roman"/>
-          <w:b/>
-          <w:bCs/>
-          <w:sz w:val="24"/>
-          <w:szCs w:val="24"/>
-          <w:u w:val="single"/>
-        </w:rPr>
-        <w:t>(.</w:t>
-      </w:r>
-      <w:proofErr w:type="spellStart"/>
-      <w:r>
-        <w:rPr>
-          <w:rFonts w:ascii="Times New Roman" w:hAnsi="Times New Roman" w:cs="Times New Roman"/>
-          <w:b/>
-          <w:bCs/>
-          <w:sz w:val="24"/>
-          <w:szCs w:val="24"/>
-          <w:u w:val="single"/>
-        </w:rPr>
-        <w:t>hasNext</w:t>
-      </w:r>
-      <w:proofErr w:type="spellEnd"/>
-      <w:proofErr w:type="gramEnd"/>
-      <w:r>
-        <w:rPr>
-          <w:rFonts w:ascii="Times New Roman" w:hAnsi="Times New Roman" w:cs="Times New Roman"/>
-          <w:b/>
-          <w:bCs/>
-          <w:sz w:val="24"/>
-          <w:szCs w:val="24"/>
-          <w:u w:val="single"/>
-        </w:rPr>
-        <w:t>() returns False)</w:t>
+        <w:t>Neither present</w:t>
       </w:r>
     </w:p>
     <w:p>
@@ -5040,875 +4762,7 @@
           <w:rFonts w:ascii="Times New Roman" w:hAnsi="Times New Roman" w:cs="Times New Roman"/>
           <w:b/>
           <w:bCs/>
-          <w:sz w:val="24"/>
-          <w:szCs w:val="24"/>
-          <w:u w:val="single"/>
-        </w:rPr>
-        <w:t>     * 3. If statement to check if the input string is inside the linked list and returns a message stating that it is</w:t>
-      </w:r>
-    </w:p>
-    <w:p>
-      <w:pPr>
-        <w:tabs>
-          <w:tab w:val="left" w:pos="1268"/>
-        </w:tabs>
-        <w:spacing w:after="160" w:line="259" w:lineRule="auto"/>
-        <w:ind w:left="810"/>
-        <w:jc w:val="both"/>
-        <w:rPr>
-          <w:rFonts w:ascii="Times New Roman" w:hAnsi="Times New Roman" w:cs="Times New Roman"/>
-          <w:b/>
-          <w:bCs/>
-          <w:sz w:val="24"/>
-          <w:szCs w:val="24"/>
-          <w:u w:val="single"/>
-        </w:rPr>
-      </w:pPr>
-      <w:r>
-        <w:rPr>
-          <w:rFonts w:ascii="Times New Roman" w:hAnsi="Times New Roman" w:cs="Times New Roman"/>
-          <w:b/>
-          <w:bCs/>
-          <w:sz w:val="24"/>
-          <w:szCs w:val="24"/>
-          <w:u w:val="single"/>
-        </w:rPr>
-        <w:t xml:space="preserve">     * 4. If the while loop ends without finding a match it </w:t>
-      </w:r>
-      <w:proofErr w:type="gramStart"/>
-      <w:r>
-        <w:rPr>
-          <w:rFonts w:ascii="Times New Roman" w:hAnsi="Times New Roman" w:cs="Times New Roman"/>
-          <w:b/>
-          <w:bCs/>
-          <w:sz w:val="24"/>
-          <w:szCs w:val="24"/>
-          <w:u w:val="single"/>
-        </w:rPr>
-        <w:t>return</w:t>
-      </w:r>
-      <w:proofErr w:type="gramEnd"/>
-      <w:r>
-        <w:rPr>
-          <w:rFonts w:ascii="Times New Roman" w:hAnsi="Times New Roman" w:cs="Times New Roman"/>
-          <w:b/>
-          <w:bCs/>
-          <w:sz w:val="24"/>
-          <w:szCs w:val="24"/>
-          <w:u w:val="single"/>
-        </w:rPr>
-        <w:t xml:space="preserve"> a message saying it in there</w:t>
-      </w:r>
-    </w:p>
-    <w:p>
-      <w:pPr>
-        <w:tabs>
-          <w:tab w:val="left" w:pos="1268"/>
-        </w:tabs>
-        <w:spacing w:after="160" w:line="259" w:lineRule="auto"/>
-        <w:ind w:left="810"/>
-        <w:jc w:val="both"/>
-        <w:rPr>
-          <w:rFonts w:ascii="Times New Roman" w:hAnsi="Times New Roman" w:cs="Times New Roman"/>
-          <w:b/>
-          <w:bCs/>
-          <w:sz w:val="24"/>
-          <w:szCs w:val="24"/>
-          <w:u w:val="single"/>
-        </w:rPr>
-      </w:pPr>
-      <w:r>
-        <w:rPr>
-          <w:rFonts w:ascii="Times New Roman" w:hAnsi="Times New Roman" w:cs="Times New Roman"/>
-          <w:b/>
-          <w:bCs/>
-          <w:sz w:val="24"/>
-          <w:szCs w:val="24"/>
-          <w:u w:val="single"/>
-        </w:rPr>
-        <w:t>     *</w:t>
-      </w:r>
-    </w:p>
-    <w:p>
-      <w:pPr>
-        <w:tabs>
-          <w:tab w:val="left" w:pos="1268"/>
-        </w:tabs>
-        <w:spacing w:after="160" w:line="259" w:lineRule="auto"/>
-        <w:ind w:left="810"/>
-        <w:jc w:val="both"/>
-        <w:rPr>
-          <w:rFonts w:ascii="Times New Roman" w:hAnsi="Times New Roman" w:cs="Times New Roman"/>
-          <w:b/>
-          <w:bCs/>
-          <w:sz w:val="24"/>
-          <w:szCs w:val="24"/>
-          <w:u w:val="single"/>
-        </w:rPr>
-      </w:pPr>
-      <w:r>
-        <w:rPr>
-          <w:rFonts w:ascii="Times New Roman" w:hAnsi="Times New Roman" w:cs="Times New Roman"/>
-          <w:b/>
-          <w:bCs/>
-          <w:sz w:val="24"/>
-          <w:szCs w:val="24"/>
-          <w:u w:val="single"/>
-        </w:rPr>
-        <w:t>     */</w:t>
-      </w:r>
-    </w:p>
-    <w:p>
-      <w:pPr>
-        <w:tabs>
-          <w:tab w:val="left" w:pos="1268"/>
-        </w:tabs>
-        <w:spacing w:after="160" w:line="259" w:lineRule="auto"/>
-        <w:ind w:left="810"/>
-        <w:jc w:val="both"/>
-        <w:rPr>
-          <w:rFonts w:ascii="Times New Roman" w:hAnsi="Times New Roman" w:cs="Times New Roman"/>
-          <w:b/>
-          <w:bCs/>
-          <w:sz w:val="24"/>
-          <w:szCs w:val="24"/>
-          <w:u w:val="single"/>
-        </w:rPr>
-      </w:pPr>
-      <w:r>
-        <w:rPr>
-          <w:rFonts w:ascii="Times New Roman" w:hAnsi="Times New Roman" w:cs="Times New Roman"/>
-          <w:b/>
-          <w:bCs/>
-          <w:sz w:val="24"/>
-          <w:szCs w:val="24"/>
-          <w:u w:val="single"/>
-        </w:rPr>
-        <w:t xml:space="preserve">    public static String </w:t>
-      </w:r>
-      <w:proofErr w:type="gramStart"/>
-      <w:r>
-        <w:rPr>
-          <w:rFonts w:ascii="Times New Roman" w:hAnsi="Times New Roman" w:cs="Times New Roman"/>
-          <w:b/>
-          <w:bCs/>
-          <w:sz w:val="24"/>
-          <w:szCs w:val="24"/>
-          <w:u w:val="single"/>
-        </w:rPr>
-        <w:t>Check(</w:t>
-      </w:r>
-      <w:proofErr w:type="gramEnd"/>
-      <w:r>
-        <w:rPr>
-          <w:rFonts w:ascii="Times New Roman" w:hAnsi="Times New Roman" w:cs="Times New Roman"/>
-          <w:b/>
-          <w:bCs/>
-          <w:sz w:val="24"/>
-          <w:szCs w:val="24"/>
-          <w:u w:val="single"/>
-        </w:rPr>
-        <w:t xml:space="preserve">LinkedList&lt;String&gt; </w:t>
-      </w:r>
-      <w:proofErr w:type="spellStart"/>
-      <w:r>
-        <w:rPr>
-          <w:rFonts w:ascii="Times New Roman" w:hAnsi="Times New Roman" w:cs="Times New Roman"/>
-          <w:b/>
-          <w:bCs/>
-          <w:sz w:val="24"/>
-          <w:szCs w:val="24"/>
-          <w:u w:val="single"/>
-        </w:rPr>
-        <w:t>linkedList</w:t>
-      </w:r>
-      <w:proofErr w:type="spellEnd"/>
-      <w:r>
-        <w:rPr>
-          <w:rFonts w:ascii="Times New Roman" w:hAnsi="Times New Roman" w:cs="Times New Roman"/>
-          <w:b/>
-          <w:bCs/>
-          <w:sz w:val="24"/>
-          <w:szCs w:val="24"/>
-          <w:u w:val="single"/>
-        </w:rPr>
-        <w:t xml:space="preserve">, String </w:t>
-      </w:r>
-      <w:proofErr w:type="gramStart"/>
-      <w:r>
-        <w:rPr>
-          <w:rFonts w:ascii="Times New Roman" w:hAnsi="Times New Roman" w:cs="Times New Roman"/>
-          <w:b/>
-          <w:bCs/>
-          <w:sz w:val="24"/>
-          <w:szCs w:val="24"/>
-          <w:u w:val="single"/>
-        </w:rPr>
-        <w:t>item){</w:t>
-      </w:r>
-      <w:proofErr w:type="gramEnd"/>
-    </w:p>
-    <w:p>
-      <w:pPr>
-        <w:tabs>
-          <w:tab w:val="left" w:pos="1268"/>
-        </w:tabs>
-        <w:spacing w:after="160" w:line="259" w:lineRule="auto"/>
-        <w:ind w:left="810"/>
-        <w:jc w:val="both"/>
-        <w:rPr>
-          <w:rFonts w:ascii="Times New Roman" w:hAnsi="Times New Roman" w:cs="Times New Roman"/>
-          <w:b/>
-          <w:bCs/>
-          <w:sz w:val="24"/>
-          <w:szCs w:val="24"/>
-          <w:u w:val="single"/>
-        </w:rPr>
-      </w:pPr>
-      <w:r>
-        <w:rPr>
-          <w:rFonts w:ascii="Times New Roman" w:hAnsi="Times New Roman" w:cs="Times New Roman"/>
-          <w:b/>
-          <w:bCs/>
-          <w:sz w:val="24"/>
-          <w:szCs w:val="24"/>
-          <w:u w:val="single"/>
-        </w:rPr>
-        <w:t xml:space="preserve">        var iterator = </w:t>
-      </w:r>
-      <w:proofErr w:type="spellStart"/>
-      <w:r>
-        <w:rPr>
-          <w:rFonts w:ascii="Times New Roman" w:hAnsi="Times New Roman" w:cs="Times New Roman"/>
-          <w:b/>
-          <w:bCs/>
-          <w:sz w:val="24"/>
-          <w:szCs w:val="24"/>
-          <w:u w:val="single"/>
-        </w:rPr>
-        <w:t>linkedList.iterator</w:t>
-      </w:r>
-      <w:proofErr w:type="spellEnd"/>
-      <w:r>
-        <w:rPr>
-          <w:rFonts w:ascii="Times New Roman" w:hAnsi="Times New Roman" w:cs="Times New Roman"/>
-          <w:b/>
-          <w:bCs/>
-          <w:sz w:val="24"/>
-          <w:szCs w:val="24"/>
-          <w:u w:val="single"/>
-        </w:rPr>
-        <w:t>(</w:t>
-      </w:r>
-      <w:proofErr w:type="gramStart"/>
-      <w:r>
-        <w:rPr>
-          <w:rFonts w:ascii="Times New Roman" w:hAnsi="Times New Roman" w:cs="Times New Roman"/>
-          <w:b/>
-          <w:bCs/>
-          <w:sz w:val="24"/>
-          <w:szCs w:val="24"/>
-          <w:u w:val="single"/>
-        </w:rPr>
-        <w:t>);</w:t>
-      </w:r>
-      <w:proofErr w:type="gramEnd"/>
-    </w:p>
-    <w:p>
-      <w:pPr>
-        <w:tabs>
-          <w:tab w:val="left" w:pos="1268"/>
-        </w:tabs>
-        <w:spacing w:after="160" w:line="259" w:lineRule="auto"/>
-        <w:ind w:left="810"/>
-        <w:jc w:val="both"/>
-        <w:rPr>
-          <w:rFonts w:ascii="Times New Roman" w:hAnsi="Times New Roman" w:cs="Times New Roman"/>
-          <w:b/>
-          <w:bCs/>
-          <w:sz w:val="24"/>
-          <w:szCs w:val="24"/>
-          <w:u w:val="single"/>
-        </w:rPr>
-      </w:pPr>
-      <w:r>
-        <w:rPr>
-          <w:rFonts w:ascii="Times New Roman" w:hAnsi="Times New Roman" w:cs="Times New Roman"/>
-          <w:b/>
-          <w:bCs/>
-          <w:sz w:val="24"/>
-          <w:szCs w:val="24"/>
-          <w:u w:val="single"/>
-        </w:rPr>
-        <w:t>        while (</w:t>
-      </w:r>
-      <w:proofErr w:type="spellStart"/>
-      <w:proofErr w:type="gramStart"/>
-      <w:r>
-        <w:rPr>
-          <w:rFonts w:ascii="Times New Roman" w:hAnsi="Times New Roman" w:cs="Times New Roman"/>
-          <w:b/>
-          <w:bCs/>
-          <w:sz w:val="24"/>
-          <w:szCs w:val="24"/>
-          <w:u w:val="single"/>
-        </w:rPr>
-        <w:t>iterator.hasNext</w:t>
-      </w:r>
-      <w:proofErr w:type="spellEnd"/>
-      <w:proofErr w:type="gramEnd"/>
-      <w:r>
-        <w:rPr>
-          <w:rFonts w:ascii="Times New Roman" w:hAnsi="Times New Roman" w:cs="Times New Roman"/>
-          <w:b/>
-          <w:bCs/>
-          <w:sz w:val="24"/>
-          <w:szCs w:val="24"/>
-          <w:u w:val="single"/>
-        </w:rPr>
-        <w:t>(</w:t>
-      </w:r>
-      <w:proofErr w:type="gramStart"/>
-      <w:r>
-        <w:rPr>
-          <w:rFonts w:ascii="Times New Roman" w:hAnsi="Times New Roman" w:cs="Times New Roman"/>
-          <w:b/>
-          <w:bCs/>
-          <w:sz w:val="24"/>
-          <w:szCs w:val="24"/>
-          <w:u w:val="single"/>
-        </w:rPr>
-        <w:t>)){</w:t>
-      </w:r>
-      <w:proofErr w:type="gramEnd"/>
-    </w:p>
-    <w:p>
-      <w:pPr>
-        <w:tabs>
-          <w:tab w:val="left" w:pos="1268"/>
-        </w:tabs>
-        <w:spacing w:after="160" w:line="259" w:lineRule="auto"/>
-        <w:ind w:left="810"/>
-        <w:jc w:val="both"/>
-        <w:rPr>
-          <w:rFonts w:ascii="Times New Roman" w:hAnsi="Times New Roman" w:cs="Times New Roman"/>
-          <w:b/>
-          <w:bCs/>
-          <w:sz w:val="24"/>
-          <w:szCs w:val="24"/>
-          <w:u w:val="single"/>
-        </w:rPr>
-      </w:pPr>
-      <w:r>
-        <w:rPr>
-          <w:rFonts w:ascii="Times New Roman" w:hAnsi="Times New Roman" w:cs="Times New Roman"/>
-          <w:b/>
-          <w:bCs/>
-          <w:sz w:val="24"/>
-          <w:szCs w:val="24"/>
-          <w:u w:val="single"/>
-        </w:rPr>
-        <w:t>            if (</w:t>
-      </w:r>
-      <w:proofErr w:type="spellStart"/>
-      <w:proofErr w:type="gramStart"/>
-      <w:r>
-        <w:rPr>
-          <w:rFonts w:ascii="Times New Roman" w:hAnsi="Times New Roman" w:cs="Times New Roman"/>
-          <w:b/>
-          <w:bCs/>
-          <w:sz w:val="24"/>
-          <w:szCs w:val="24"/>
-          <w:u w:val="single"/>
-        </w:rPr>
-        <w:t>iterator.next</w:t>
-      </w:r>
-      <w:proofErr w:type="spellEnd"/>
-      <w:proofErr w:type="gramEnd"/>
-      <w:r>
-        <w:rPr>
-          <w:rFonts w:ascii="Times New Roman" w:hAnsi="Times New Roman" w:cs="Times New Roman"/>
-          <w:b/>
-          <w:bCs/>
-          <w:sz w:val="24"/>
-          <w:szCs w:val="24"/>
-          <w:u w:val="single"/>
-        </w:rPr>
-        <w:t>(</w:t>
-      </w:r>
-      <w:proofErr w:type="gramStart"/>
-      <w:r>
-        <w:rPr>
-          <w:rFonts w:ascii="Times New Roman" w:hAnsi="Times New Roman" w:cs="Times New Roman"/>
-          <w:b/>
-          <w:bCs/>
-          <w:sz w:val="24"/>
-          <w:szCs w:val="24"/>
-          <w:u w:val="single"/>
-        </w:rPr>
-        <w:t>).</w:t>
-      </w:r>
-      <w:proofErr w:type="spellStart"/>
-      <w:r>
-        <w:rPr>
-          <w:rFonts w:ascii="Times New Roman" w:hAnsi="Times New Roman" w:cs="Times New Roman"/>
-          <w:b/>
-          <w:bCs/>
-          <w:sz w:val="24"/>
-          <w:szCs w:val="24"/>
-          <w:u w:val="single"/>
-        </w:rPr>
-        <w:t>toLowerCase</w:t>
-      </w:r>
-      <w:proofErr w:type="spellEnd"/>
-      <w:proofErr w:type="gramEnd"/>
-      <w:r>
-        <w:rPr>
-          <w:rFonts w:ascii="Times New Roman" w:hAnsi="Times New Roman" w:cs="Times New Roman"/>
-          <w:b/>
-          <w:bCs/>
-          <w:sz w:val="24"/>
-          <w:szCs w:val="24"/>
-          <w:u w:val="single"/>
-        </w:rPr>
-        <w:t>(</w:t>
-      </w:r>
-      <w:proofErr w:type="gramStart"/>
-      <w:r>
-        <w:rPr>
-          <w:rFonts w:ascii="Times New Roman" w:hAnsi="Times New Roman" w:cs="Times New Roman"/>
-          <w:b/>
-          <w:bCs/>
-          <w:sz w:val="24"/>
-          <w:szCs w:val="24"/>
-          <w:u w:val="single"/>
-        </w:rPr>
-        <w:t>).equals</w:t>
-      </w:r>
-      <w:proofErr w:type="gramEnd"/>
-      <w:r>
-        <w:rPr>
-          <w:rFonts w:ascii="Times New Roman" w:hAnsi="Times New Roman" w:cs="Times New Roman"/>
-          <w:b/>
-          <w:bCs/>
-          <w:sz w:val="24"/>
-          <w:szCs w:val="24"/>
-          <w:u w:val="single"/>
-        </w:rPr>
-        <w:t>(</w:t>
-      </w:r>
-      <w:proofErr w:type="spellStart"/>
-      <w:proofErr w:type="gramStart"/>
-      <w:r>
-        <w:rPr>
-          <w:rFonts w:ascii="Times New Roman" w:hAnsi="Times New Roman" w:cs="Times New Roman"/>
-          <w:b/>
-          <w:bCs/>
-          <w:sz w:val="24"/>
-          <w:szCs w:val="24"/>
-          <w:u w:val="single"/>
-        </w:rPr>
-        <w:t>item.toLowerCase</w:t>
-      </w:r>
-      <w:proofErr w:type="spellEnd"/>
-      <w:proofErr w:type="gramEnd"/>
-      <w:r>
-        <w:rPr>
-          <w:rFonts w:ascii="Times New Roman" w:hAnsi="Times New Roman" w:cs="Times New Roman"/>
-          <w:b/>
-          <w:bCs/>
-          <w:sz w:val="24"/>
-          <w:szCs w:val="24"/>
-          <w:u w:val="single"/>
-        </w:rPr>
-        <w:t>()</w:t>
-      </w:r>
-      <w:proofErr w:type="gramStart"/>
-      <w:r>
-        <w:rPr>
-          <w:rFonts w:ascii="Times New Roman" w:hAnsi="Times New Roman" w:cs="Times New Roman"/>
-          <w:b/>
-          <w:bCs/>
-          <w:sz w:val="24"/>
-          <w:szCs w:val="24"/>
-          <w:u w:val="single"/>
-        </w:rPr>
-        <w:t>)){</w:t>
-      </w:r>
-      <w:proofErr w:type="gramEnd"/>
-    </w:p>
-    <w:p>
-      <w:pPr>
-        <w:tabs>
-          <w:tab w:val="left" w:pos="1268"/>
-        </w:tabs>
-        <w:spacing w:after="160" w:line="259" w:lineRule="auto"/>
-        <w:ind w:left="810"/>
-        <w:jc w:val="both"/>
-        <w:rPr>
-          <w:rFonts w:ascii="Times New Roman" w:hAnsi="Times New Roman" w:cs="Times New Roman"/>
-          <w:b/>
-          <w:bCs/>
-          <w:sz w:val="24"/>
-          <w:szCs w:val="24"/>
-          <w:u w:val="single"/>
-        </w:rPr>
-      </w:pPr>
-      <w:r>
-        <w:rPr>
-          <w:rFonts w:ascii="Times New Roman" w:hAnsi="Times New Roman" w:cs="Times New Roman"/>
-          <w:b/>
-          <w:bCs/>
-          <w:sz w:val="24"/>
-          <w:szCs w:val="24"/>
-          <w:u w:val="single"/>
-        </w:rPr>
-        <w:t>                String message = "Fruit "+ item +" is present</w:t>
-      </w:r>
-      <w:proofErr w:type="gramStart"/>
-      <w:r>
-        <w:rPr>
-          <w:rFonts w:ascii="Times New Roman" w:hAnsi="Times New Roman" w:cs="Times New Roman"/>
-          <w:b/>
-          <w:bCs/>
-          <w:sz w:val="24"/>
-          <w:szCs w:val="24"/>
-          <w:u w:val="single"/>
-        </w:rPr>
-        <w:t>";</w:t>
-      </w:r>
-      <w:proofErr w:type="gramEnd"/>
-    </w:p>
-    <w:p>
-      <w:pPr>
-        <w:tabs>
-          <w:tab w:val="left" w:pos="1268"/>
-        </w:tabs>
-        <w:spacing w:after="160" w:line="259" w:lineRule="auto"/>
-        <w:ind w:left="810"/>
-        <w:jc w:val="both"/>
-        <w:rPr>
-          <w:rFonts w:ascii="Times New Roman" w:hAnsi="Times New Roman" w:cs="Times New Roman"/>
-          <w:b/>
-          <w:bCs/>
-          <w:sz w:val="24"/>
-          <w:szCs w:val="24"/>
-          <w:u w:val="single"/>
-        </w:rPr>
-      </w:pPr>
-      <w:r>
-        <w:rPr>
-          <w:rFonts w:ascii="Times New Roman" w:hAnsi="Times New Roman" w:cs="Times New Roman"/>
-          <w:b/>
-          <w:bCs/>
-          <w:sz w:val="24"/>
-          <w:szCs w:val="24"/>
-          <w:u w:val="single"/>
-        </w:rPr>
-        <w:t xml:space="preserve">                return </w:t>
-      </w:r>
-      <w:proofErr w:type="gramStart"/>
-      <w:r>
-        <w:rPr>
-          <w:rFonts w:ascii="Times New Roman" w:hAnsi="Times New Roman" w:cs="Times New Roman"/>
-          <w:b/>
-          <w:bCs/>
-          <w:sz w:val="24"/>
-          <w:szCs w:val="24"/>
-          <w:u w:val="single"/>
-        </w:rPr>
-        <w:t>message;</w:t>
-      </w:r>
-      <w:proofErr w:type="gramEnd"/>
-    </w:p>
-    <w:p>
-      <w:pPr>
-        <w:tabs>
-          <w:tab w:val="left" w:pos="1268"/>
-        </w:tabs>
-        <w:spacing w:after="160" w:line="259" w:lineRule="auto"/>
-        <w:ind w:left="810"/>
-        <w:jc w:val="both"/>
-        <w:rPr>
-          <w:rFonts w:ascii="Times New Roman" w:hAnsi="Times New Roman" w:cs="Times New Roman"/>
-          <w:b/>
-          <w:bCs/>
-          <w:sz w:val="24"/>
-          <w:szCs w:val="24"/>
-          <w:u w:val="single"/>
-        </w:rPr>
-      </w:pPr>
-      <w:r>
-        <w:rPr>
-          <w:rFonts w:ascii="Times New Roman" w:hAnsi="Times New Roman" w:cs="Times New Roman"/>
-          <w:b/>
-          <w:bCs/>
-          <w:sz w:val="24"/>
-          <w:szCs w:val="24"/>
-          <w:u w:val="single"/>
-        </w:rPr>
-        <w:t>            }</w:t>
-      </w:r>
-    </w:p>
-    <w:p>
-      <w:pPr>
-        <w:tabs>
-          <w:tab w:val="left" w:pos="1268"/>
-        </w:tabs>
-        <w:spacing w:after="160" w:line="259" w:lineRule="auto"/>
-        <w:ind w:left="810"/>
-        <w:jc w:val="both"/>
-        <w:rPr>
-          <w:rFonts w:ascii="Times New Roman" w:hAnsi="Times New Roman" w:cs="Times New Roman"/>
-          <w:b/>
-          <w:bCs/>
-          <w:sz w:val="24"/>
-          <w:szCs w:val="24"/>
-          <w:u w:val="single"/>
-        </w:rPr>
-      </w:pPr>
-      <w:r>
-        <w:rPr>
-          <w:rFonts w:ascii="Times New Roman" w:hAnsi="Times New Roman" w:cs="Times New Roman"/>
-          <w:b/>
-          <w:bCs/>
-          <w:sz w:val="24"/>
-          <w:szCs w:val="24"/>
-          <w:u w:val="single"/>
-        </w:rPr>
-        <w:t>        }</w:t>
-      </w:r>
-    </w:p>
-    <w:p>
-      <w:pPr>
-        <w:tabs>
-          <w:tab w:val="left" w:pos="1268"/>
-        </w:tabs>
-        <w:spacing w:after="160" w:line="259" w:lineRule="auto"/>
-        <w:ind w:left="810"/>
-        <w:jc w:val="both"/>
-        <w:rPr>
-          <w:rFonts w:ascii="Times New Roman" w:hAnsi="Times New Roman" w:cs="Times New Roman"/>
-          <w:b/>
-          <w:bCs/>
-          <w:sz w:val="24"/>
-          <w:szCs w:val="24"/>
-          <w:u w:val="single"/>
-        </w:rPr>
-      </w:pPr>
-      <w:r>
-        <w:rPr>
-          <w:rFonts w:ascii="Times New Roman" w:hAnsi="Times New Roman" w:cs="Times New Roman"/>
-          <w:b/>
-          <w:bCs/>
-          <w:sz w:val="24"/>
-          <w:szCs w:val="24"/>
-          <w:u w:val="single"/>
-        </w:rPr>
-        <w:lastRenderedPageBreak/>
-        <w:t>        String message = "Fruit "+ item +" is not present</w:t>
-      </w:r>
-      <w:proofErr w:type="gramStart"/>
-      <w:r>
-        <w:rPr>
-          <w:rFonts w:ascii="Times New Roman" w:hAnsi="Times New Roman" w:cs="Times New Roman"/>
-          <w:b/>
-          <w:bCs/>
-          <w:sz w:val="24"/>
-          <w:szCs w:val="24"/>
-          <w:u w:val="single"/>
-        </w:rPr>
-        <w:t>";</w:t>
-      </w:r>
-      <w:proofErr w:type="gramEnd"/>
-    </w:p>
-    <w:p>
-      <w:pPr>
-        <w:tabs>
-          <w:tab w:val="left" w:pos="1268"/>
-        </w:tabs>
-        <w:spacing w:after="160" w:line="259" w:lineRule="auto"/>
-        <w:ind w:left="810"/>
-        <w:jc w:val="both"/>
-        <w:rPr>
-          <w:rFonts w:ascii="Times New Roman" w:hAnsi="Times New Roman" w:cs="Times New Roman"/>
-          <w:b/>
-          <w:bCs/>
-          <w:sz w:val="24"/>
-          <w:szCs w:val="24"/>
-          <w:u w:val="single"/>
-        </w:rPr>
-      </w:pPr>
-      <w:r>
-        <w:rPr>
-          <w:rFonts w:ascii="Times New Roman" w:hAnsi="Times New Roman" w:cs="Times New Roman"/>
-          <w:b/>
-          <w:bCs/>
-          <w:sz w:val="24"/>
-          <w:szCs w:val="24"/>
-          <w:u w:val="single"/>
-        </w:rPr>
-        <w:t xml:space="preserve">        return </w:t>
-      </w:r>
-      <w:proofErr w:type="gramStart"/>
-      <w:r>
-        <w:rPr>
-          <w:rFonts w:ascii="Times New Roman" w:hAnsi="Times New Roman" w:cs="Times New Roman"/>
-          <w:b/>
-          <w:bCs/>
-          <w:sz w:val="24"/>
-          <w:szCs w:val="24"/>
-          <w:u w:val="single"/>
-        </w:rPr>
-        <w:t>message;</w:t>
-      </w:r>
-      <w:proofErr w:type="gramEnd"/>
-    </w:p>
-    <w:p>
-      <w:pPr>
-        <w:tabs>
-          <w:tab w:val="left" w:pos="1268"/>
-        </w:tabs>
-        <w:spacing w:after="160" w:line="259" w:lineRule="auto"/>
-        <w:ind w:left="810"/>
-        <w:jc w:val="both"/>
-        <w:rPr>
-          <w:rFonts w:ascii="Times New Roman" w:hAnsi="Times New Roman" w:cs="Times New Roman"/>
-          <w:b/>
-          <w:bCs/>
-          <w:sz w:val="24"/>
-          <w:szCs w:val="24"/>
-          <w:u w:val="single"/>
-        </w:rPr>
-      </w:pPr>
-      <w:r>
-        <w:rPr>
-          <w:rFonts w:ascii="Times New Roman" w:hAnsi="Times New Roman" w:cs="Times New Roman"/>
-          <w:b/>
-          <w:bCs/>
-          <w:sz w:val="24"/>
-          <w:szCs w:val="24"/>
-          <w:u w:val="single"/>
-        </w:rPr>
-        <w:t>        }</w:t>
-      </w:r>
-    </w:p>
-    <w:p>
-      <w:pPr>
-        <w:tabs>
-          <w:tab w:val="left" w:pos="1268"/>
-        </w:tabs>
-        <w:spacing w:after="160" w:line="259" w:lineRule="auto"/>
-        <w:ind w:left="810"/>
-        <w:jc w:val="both"/>
-        <w:rPr>
-          <w:rFonts w:ascii="Times New Roman" w:hAnsi="Times New Roman" w:cs="Times New Roman"/>
-          <w:b/>
-          <w:bCs/>
-          <w:sz w:val="24"/>
-          <w:szCs w:val="24"/>
-          <w:u w:val="single"/>
-        </w:rPr>
-      </w:pPr>
-      <w:r>
-        <w:rPr>
-          <w:rFonts w:ascii="Times New Roman" w:hAnsi="Times New Roman" w:cs="Times New Roman"/>
-          <w:b/>
-          <w:bCs/>
-          <w:sz w:val="24"/>
-          <w:szCs w:val="24"/>
-          <w:u w:val="single"/>
-        </w:rPr>
-        <w:t>    }</w:t>
-      </w:r>
-    </w:p>
-    <w:p>
-      <w:pPr>
-        <w:tabs>
-          <w:tab w:val="left" w:pos="1268"/>
-        </w:tabs>
-        <w:spacing w:after="160" w:line="259" w:lineRule="auto"/>
-        <w:ind w:left="810"/>
-        <w:jc w:val="both"/>
-        <w:rPr>
-          <w:rFonts w:ascii="Times New Roman" w:hAnsi="Times New Roman" w:cs="Times New Roman"/>
-          <w:b/>
-          <w:bCs/>
-          <w:sz w:val="24"/>
-          <w:szCs w:val="24"/>
-          <w:u w:val="single"/>
-        </w:rPr>
-      </w:pPr>
-    </w:p>
-    <w:p>
-      <w:pPr>
-        <w:tabs>
-          <w:tab w:val="left" w:pos="1268"/>
-        </w:tabs>
-        <w:spacing w:after="160" w:line="259" w:lineRule="auto"/>
-        <w:ind w:left="810"/>
-        <w:jc w:val="both"/>
-        <w:rPr>
-          <w:rFonts w:ascii="Times New Roman" w:hAnsi="Times New Roman" w:cs="Times New Roman"/>
-          <w:b/>
-          <w:bCs/>
-          <w:sz w:val="24"/>
-          <w:szCs w:val="24"/>
-          <w:u w:val="single"/>
-        </w:rPr>
-      </w:pPr>
-    </w:p>
-    <w:p>
-      <w:pPr>
-        <w:tabs>
-          <w:tab w:val="left" w:pos="1268"/>
-        </w:tabs>
-        <w:spacing w:after="160" w:line="259" w:lineRule="auto"/>
-        <w:ind w:left="810"/>
-        <w:jc w:val="both"/>
-        <w:rPr>
-          <w:rFonts w:ascii="Times New Roman" w:hAnsi="Times New Roman" w:cs="Times New Roman"/>
-          <w:b/>
-          <w:bCs/>
-          <w:sz w:val="24"/>
-          <w:szCs w:val="24"/>
-          <w:u w:val="single"/>
-        </w:rPr>
-      </w:pPr>
-      <w:r>
-        <w:rPr>
-          <w:rFonts w:ascii="Times New Roman" w:hAnsi="Times New Roman" w:cs="Times New Roman"/>
-          <w:b/>
-          <w:bCs/>
-          <w:sz w:val="24"/>
-          <w:szCs w:val="24"/>
-          <w:u w:val="single"/>
-        </w:rPr>
-        <w:t>Neither present</w:t>
-      </w:r>
-    </w:p>
-    <w:p>
-      <w:pPr>
-        <w:tabs>
-          <w:tab w:val="left" w:pos="1268"/>
-        </w:tabs>
-        <w:spacing w:after="160" w:line="259" w:lineRule="auto"/>
-        <w:ind w:left="810"/>
-        <w:jc w:val="both"/>
-        <w:rPr>
-          <w:rFonts w:ascii="Times New Roman" w:hAnsi="Times New Roman" w:cs="Times New Roman"/>
-          <w:b/>
-          <w:bCs/>
-          <w:sz w:val="24"/>
-          <w:szCs w:val="24"/>
-          <w:u w:val="single"/>
-        </w:rPr>
-      </w:pPr>
-      <w:r>
-        <w:rPr>
-          <w:rFonts w:ascii="Times New Roman" w:hAnsi="Times New Roman" w:cs="Times New Roman"/>
-          <w:b/>
-          <w:bCs/>
+          <w:noProof/>
           <w:sz w:val="24"/>
           <w:szCs w:val="24"/>
           <w:u w:val="single"/>
@@ -6018,6 +4872,7 @@
           <w:rFonts w:ascii="Times New Roman" w:hAnsi="Times New Roman" w:cs="Times New Roman"/>
           <w:b/>
           <w:bCs/>
+          <w:noProof/>
           <w:color w:val="auto"/>
           <w:sz w:val="24"/>
           <w:szCs w:val="24"/>
@@ -6078,18 +4933,6 @@
           <w:u w:val="single"/>
         </w:rPr>
       </w:pPr>
-      <w:r>
-        <w:rPr>
-          <w:rFonts w:ascii="Times New Roman" w:hAnsi="Times New Roman" w:cs="Times New Roman"/>
-          <w:b/>
-          <w:bCs/>
-          <w:color w:val="auto"/>
-          <w:sz w:val="24"/>
-          <w:szCs w:val="24"/>
-          <w:u w:val="single"/>
-        </w:rPr>
-        <w:t>Guava Present</w:t>
-      </w:r>
     </w:p>
     <w:p>
       <w:pPr>
@@ -6114,6 +4957,39 @@
           <w:rFonts w:ascii="Times New Roman" w:hAnsi="Times New Roman" w:cs="Times New Roman"/>
           <w:b/>
           <w:bCs/>
+          <w:color w:val="auto"/>
+          <w:sz w:val="24"/>
+          <w:szCs w:val="24"/>
+          <w:u w:val="single"/>
+        </w:rPr>
+        <w:lastRenderedPageBreak/>
+        <w:t>Guava Present</w:t>
+      </w:r>
+    </w:p>
+    <w:p>
+      <w:pPr>
+        <w:tabs>
+          <w:tab w:val="left" w:pos="1268"/>
+        </w:tabs>
+        <w:spacing w:after="160" w:line="259" w:lineRule="auto"/>
+        <w:ind w:left="810"/>
+        <w:jc w:val="both"/>
+        <w:rPr>
+          <w:rFonts w:ascii="Times New Roman" w:hAnsi="Times New Roman" w:cs="Times New Roman"/>
+          <w:b/>
+          <w:bCs/>
+          <w:color w:val="auto"/>
+          <w:sz w:val="24"/>
+          <w:szCs w:val="24"/>
+          <w:u w:val="single"/>
+        </w:rPr>
+      </w:pPr>
+      <w:r>
+        <w:rPr>
+          <w:rFonts w:ascii="Times New Roman" w:hAnsi="Times New Roman" w:cs="Times New Roman"/>
+          <w:b/>
+          <w:bCs/>
+          <w:noProof/>
           <w:color w:val="auto"/>
           <w:sz w:val="24"/>
           <w:szCs w:val="24"/>
@@ -6203,7 +5079,6 @@
           <w:szCs w:val="24"/>
           <w:u w:val="single"/>
         </w:rPr>
-        <w:lastRenderedPageBreak/>
         <w:t>Both Present</w:t>
       </w:r>
     </w:p>
@@ -6230,6 +5105,7 @@
           <w:rFonts w:ascii="Times New Roman" w:hAnsi="Times New Roman" w:cs="Times New Roman"/>
           <w:b/>
           <w:bCs/>
+          <w:noProof/>
           <w:color w:val="auto"/>
           <w:sz w:val="24"/>
           <w:szCs w:val="24"/>
@@ -6271,44 +5147,6 @@
           </wp:inline>
         </w:drawing>
       </w:r>
-    </w:p>
-    <w:p>
-      <w:pPr>
-        <w:tabs>
-          <w:tab w:val="left" w:pos="1268"/>
-        </w:tabs>
-        <w:spacing w:after="160" w:line="259" w:lineRule="auto"/>
-        <w:ind w:left="810"/>
-        <w:jc w:val="both"/>
-        <w:rPr>
-          <w:rFonts w:ascii="Times New Roman" w:hAnsi="Times New Roman" w:cs="Times New Roman"/>
-          <w:b/>
-          <w:bCs/>
-          <w:color w:val="auto"/>
-          <w:sz w:val="24"/>
-          <w:szCs w:val="24"/>
-          <w:u w:val="single"/>
-        </w:rPr>
-      </w:pPr>
-    </w:p>
-    <w:p>
-      <w:pPr>
-        <w:tabs>
-          <w:tab w:val="left" w:pos="1268"/>
-        </w:tabs>
-        <w:spacing w:after="160" w:line="259" w:lineRule="auto"/>
-        <w:ind w:left="810"/>
-        <w:jc w:val="both"/>
-        <w:rPr>
-          <w:rFonts w:ascii="Times New Roman" w:hAnsi="Times New Roman" w:cs="Times New Roman"/>
-          <w:b/>
-          <w:bCs/>
-          <w:color w:val="auto"/>
-          <w:sz w:val="24"/>
-          <w:szCs w:val="24"/>
-          <w:u w:val="single"/>
-        </w:rPr>
-      </w:pPr>
     </w:p>
     <w:p>
       <w:pPr>
@@ -7438,7 +6276,1203 @@
           <w:u w:val="single"/>
         </w:rPr>
         <w:lastRenderedPageBreak/>
-        <w:t xml:space="preserve">Solution </w:t>
+        <w:t>Solution</w:t>
+      </w:r>
+    </w:p>
+    <w:p>
+      <w:pPr>
+        <w:tabs>
+          <w:tab w:val="left" w:pos="1268"/>
+        </w:tabs>
+        <w:spacing w:after="160" w:line="259" w:lineRule="auto"/>
+        <w:ind w:left="810"/>
+        <w:jc w:val="both"/>
+        <w:rPr>
+          <w:rFonts w:ascii="Times New Roman" w:hAnsi="Times New Roman" w:cs="Times New Roman"/>
+          <w:color w:val="auto"/>
+          <w:sz w:val="24"/>
+          <w:szCs w:val="24"/>
+        </w:rPr>
+      </w:pPr>
+      <w:r>
+        <w:rPr>
+          <w:rFonts w:ascii="Times New Roman" w:hAnsi="Times New Roman" w:cs="Times New Roman"/>
+          <w:color w:val="auto"/>
+          <w:sz w:val="24"/>
+          <w:szCs w:val="24"/>
+        </w:rPr>
+        <w:t>//import LinkedList module</w:t>
+      </w:r>
+    </w:p>
+    <w:p>
+      <w:pPr>
+        <w:tabs>
+          <w:tab w:val="left" w:pos="1268"/>
+        </w:tabs>
+        <w:spacing w:after="160" w:line="259" w:lineRule="auto"/>
+        <w:ind w:left="810"/>
+        <w:jc w:val="both"/>
+        <w:rPr>
+          <w:rFonts w:ascii="Times New Roman" w:hAnsi="Times New Roman" w:cs="Times New Roman"/>
+          <w:color w:val="auto"/>
+          <w:sz w:val="24"/>
+          <w:szCs w:val="24"/>
+        </w:rPr>
+      </w:pPr>
+      <w:r>
+        <w:rPr>
+          <w:rFonts w:ascii="Times New Roman" w:hAnsi="Times New Roman" w:cs="Times New Roman"/>
+          <w:color w:val="auto"/>
+          <w:sz w:val="24"/>
+          <w:szCs w:val="24"/>
+        </w:rPr>
+        <w:t xml:space="preserve">import </w:t>
+      </w:r>
+      <w:proofErr w:type="spellStart"/>
+      <w:proofErr w:type="gramStart"/>
+      <w:r>
+        <w:rPr>
+          <w:rFonts w:ascii="Times New Roman" w:hAnsi="Times New Roman" w:cs="Times New Roman"/>
+          <w:color w:val="auto"/>
+          <w:sz w:val="24"/>
+          <w:szCs w:val="24"/>
+        </w:rPr>
+        <w:t>java.util</w:t>
+      </w:r>
+      <w:proofErr w:type="gramEnd"/>
+      <w:r>
+        <w:rPr>
+          <w:rFonts w:ascii="Times New Roman" w:hAnsi="Times New Roman" w:cs="Times New Roman"/>
+          <w:color w:val="auto"/>
+          <w:sz w:val="24"/>
+          <w:szCs w:val="24"/>
+        </w:rPr>
+        <w:t>.</w:t>
+      </w:r>
+      <w:proofErr w:type="gramStart"/>
+      <w:r>
+        <w:rPr>
+          <w:rFonts w:ascii="Times New Roman" w:hAnsi="Times New Roman" w:cs="Times New Roman"/>
+          <w:color w:val="auto"/>
+          <w:sz w:val="24"/>
+          <w:szCs w:val="24"/>
+        </w:rPr>
+        <w:t>LinkedList</w:t>
+      </w:r>
+      <w:proofErr w:type="spellEnd"/>
+      <w:r>
+        <w:rPr>
+          <w:rFonts w:ascii="Times New Roman" w:hAnsi="Times New Roman" w:cs="Times New Roman"/>
+          <w:color w:val="auto"/>
+          <w:sz w:val="24"/>
+          <w:szCs w:val="24"/>
+        </w:rPr>
+        <w:t>;</w:t>
+      </w:r>
+      <w:proofErr w:type="gramEnd"/>
+    </w:p>
+    <w:p>
+      <w:pPr>
+        <w:tabs>
+          <w:tab w:val="left" w:pos="1268"/>
+        </w:tabs>
+        <w:spacing w:after="160" w:line="259" w:lineRule="auto"/>
+        <w:ind w:left="810"/>
+        <w:jc w:val="both"/>
+        <w:rPr>
+          <w:rFonts w:ascii="Times New Roman" w:hAnsi="Times New Roman" w:cs="Times New Roman"/>
+          <w:color w:val="auto"/>
+          <w:sz w:val="24"/>
+          <w:szCs w:val="24"/>
+        </w:rPr>
+      </w:pPr>
+    </w:p>
+    <w:p>
+      <w:pPr>
+        <w:tabs>
+          <w:tab w:val="left" w:pos="1268"/>
+        </w:tabs>
+        <w:spacing w:after="160" w:line="259" w:lineRule="auto"/>
+        <w:ind w:left="810"/>
+        <w:jc w:val="both"/>
+        <w:rPr>
+          <w:rFonts w:ascii="Times New Roman" w:hAnsi="Times New Roman" w:cs="Times New Roman"/>
+          <w:color w:val="auto"/>
+          <w:sz w:val="24"/>
+          <w:szCs w:val="24"/>
+        </w:rPr>
+      </w:pPr>
+      <w:r>
+        <w:rPr>
+          <w:rFonts w:ascii="Times New Roman" w:hAnsi="Times New Roman" w:cs="Times New Roman"/>
+          <w:color w:val="auto"/>
+          <w:sz w:val="24"/>
+          <w:szCs w:val="24"/>
+        </w:rPr>
+        <w:t xml:space="preserve">public class </w:t>
+      </w:r>
+      <w:proofErr w:type="spellStart"/>
+      <w:proofErr w:type="gramStart"/>
+      <w:r>
+        <w:rPr>
+          <w:rFonts w:ascii="Times New Roman" w:hAnsi="Times New Roman" w:cs="Times New Roman"/>
+          <w:color w:val="auto"/>
+          <w:sz w:val="24"/>
+          <w:szCs w:val="24"/>
+        </w:rPr>
+        <w:t>ReplaceElement</w:t>
+      </w:r>
+      <w:proofErr w:type="spellEnd"/>
+      <w:r>
+        <w:rPr>
+          <w:rFonts w:ascii="Times New Roman" w:hAnsi="Times New Roman" w:cs="Times New Roman"/>
+          <w:color w:val="auto"/>
+          <w:sz w:val="24"/>
+          <w:szCs w:val="24"/>
+        </w:rPr>
+        <w:t>{</w:t>
+      </w:r>
+      <w:proofErr w:type="gramEnd"/>
+    </w:p>
+    <w:p>
+      <w:pPr>
+        <w:tabs>
+          <w:tab w:val="left" w:pos="1268"/>
+        </w:tabs>
+        <w:spacing w:after="160" w:line="259" w:lineRule="auto"/>
+        <w:ind w:left="810"/>
+        <w:jc w:val="both"/>
+        <w:rPr>
+          <w:rFonts w:ascii="Times New Roman" w:hAnsi="Times New Roman" w:cs="Times New Roman"/>
+          <w:color w:val="auto"/>
+          <w:sz w:val="24"/>
+          <w:szCs w:val="24"/>
+        </w:rPr>
+      </w:pPr>
+      <w:r>
+        <w:rPr>
+          <w:rFonts w:ascii="Times New Roman" w:hAnsi="Times New Roman" w:cs="Times New Roman"/>
+          <w:color w:val="auto"/>
+          <w:sz w:val="24"/>
+          <w:szCs w:val="24"/>
+        </w:rPr>
+        <w:t xml:space="preserve">    public static void </w:t>
+      </w:r>
+      <w:proofErr w:type="gramStart"/>
+      <w:r>
+        <w:rPr>
+          <w:rFonts w:ascii="Times New Roman" w:hAnsi="Times New Roman" w:cs="Times New Roman"/>
+          <w:color w:val="auto"/>
+          <w:sz w:val="24"/>
+          <w:szCs w:val="24"/>
+        </w:rPr>
+        <w:t>main(String[</w:t>
+      </w:r>
+      <w:proofErr w:type="gramEnd"/>
+      <w:r>
+        <w:rPr>
+          <w:rFonts w:ascii="Times New Roman" w:hAnsi="Times New Roman" w:cs="Times New Roman"/>
+          <w:color w:val="auto"/>
+          <w:sz w:val="24"/>
+          <w:szCs w:val="24"/>
+        </w:rPr>
+        <w:t xml:space="preserve">] </w:t>
+      </w:r>
+      <w:proofErr w:type="spellStart"/>
+      <w:proofErr w:type="gramStart"/>
+      <w:r>
+        <w:rPr>
+          <w:rFonts w:ascii="Times New Roman" w:hAnsi="Times New Roman" w:cs="Times New Roman"/>
+          <w:color w:val="auto"/>
+          <w:sz w:val="24"/>
+          <w:szCs w:val="24"/>
+        </w:rPr>
+        <w:t>args</w:t>
+      </w:r>
+      <w:proofErr w:type="spellEnd"/>
+      <w:r>
+        <w:rPr>
+          <w:rFonts w:ascii="Times New Roman" w:hAnsi="Times New Roman" w:cs="Times New Roman"/>
+          <w:color w:val="auto"/>
+          <w:sz w:val="24"/>
+          <w:szCs w:val="24"/>
+        </w:rPr>
+        <w:t>) {</w:t>
+      </w:r>
+      <w:proofErr w:type="gramEnd"/>
+    </w:p>
+    <w:p>
+      <w:pPr>
+        <w:tabs>
+          <w:tab w:val="left" w:pos="1268"/>
+        </w:tabs>
+        <w:spacing w:after="160" w:line="259" w:lineRule="auto"/>
+        <w:ind w:left="810"/>
+        <w:jc w:val="both"/>
+        <w:rPr>
+          <w:rFonts w:ascii="Times New Roman" w:hAnsi="Times New Roman" w:cs="Times New Roman"/>
+          <w:color w:val="auto"/>
+          <w:sz w:val="24"/>
+          <w:szCs w:val="24"/>
+        </w:rPr>
+      </w:pPr>
+      <w:r>
+        <w:rPr>
+          <w:rFonts w:ascii="Times New Roman" w:hAnsi="Times New Roman" w:cs="Times New Roman"/>
+          <w:color w:val="auto"/>
+          <w:sz w:val="24"/>
+          <w:szCs w:val="24"/>
+        </w:rPr>
+        <w:t xml:space="preserve">        //create Linked List call </w:t>
+      </w:r>
+      <w:proofErr w:type="spellStart"/>
+      <w:r>
+        <w:rPr>
+          <w:rFonts w:ascii="Times New Roman" w:hAnsi="Times New Roman" w:cs="Times New Roman"/>
+          <w:color w:val="auto"/>
+          <w:sz w:val="24"/>
+          <w:szCs w:val="24"/>
+        </w:rPr>
+        <w:t>fru_list</w:t>
+      </w:r>
+      <w:proofErr w:type="spellEnd"/>
+    </w:p>
+    <w:p>
+      <w:pPr>
+        <w:tabs>
+          <w:tab w:val="left" w:pos="1268"/>
+        </w:tabs>
+        <w:spacing w:after="160" w:line="259" w:lineRule="auto"/>
+        <w:ind w:left="810"/>
+        <w:jc w:val="both"/>
+        <w:rPr>
+          <w:rFonts w:ascii="Times New Roman" w:hAnsi="Times New Roman" w:cs="Times New Roman"/>
+          <w:color w:val="auto"/>
+          <w:sz w:val="24"/>
+          <w:szCs w:val="24"/>
+        </w:rPr>
+      </w:pPr>
+      <w:r>
+        <w:rPr>
+          <w:rFonts w:ascii="Times New Roman" w:hAnsi="Times New Roman" w:cs="Times New Roman"/>
+          <w:color w:val="auto"/>
+          <w:sz w:val="24"/>
+          <w:szCs w:val="24"/>
+        </w:rPr>
+        <w:t xml:space="preserve">        LinkedList&lt;String&gt; </w:t>
+      </w:r>
+      <w:proofErr w:type="spellStart"/>
+      <w:r>
+        <w:rPr>
+          <w:rFonts w:ascii="Times New Roman" w:hAnsi="Times New Roman" w:cs="Times New Roman"/>
+          <w:color w:val="auto"/>
+          <w:sz w:val="24"/>
+          <w:szCs w:val="24"/>
+        </w:rPr>
+        <w:t>fru_list</w:t>
+      </w:r>
+      <w:proofErr w:type="spellEnd"/>
+      <w:r>
+        <w:rPr>
+          <w:rFonts w:ascii="Times New Roman" w:hAnsi="Times New Roman" w:cs="Times New Roman"/>
+          <w:color w:val="auto"/>
+          <w:sz w:val="24"/>
+          <w:szCs w:val="24"/>
+        </w:rPr>
+        <w:t xml:space="preserve"> = new LinkedList&lt;String</w:t>
+      </w:r>
+      <w:proofErr w:type="gramStart"/>
+      <w:r>
+        <w:rPr>
+          <w:rFonts w:ascii="Times New Roman" w:hAnsi="Times New Roman" w:cs="Times New Roman"/>
+          <w:color w:val="auto"/>
+          <w:sz w:val="24"/>
+          <w:szCs w:val="24"/>
+        </w:rPr>
+        <w:t>&gt;();</w:t>
+      </w:r>
+      <w:proofErr w:type="gramEnd"/>
+    </w:p>
+    <w:p>
+      <w:pPr>
+        <w:tabs>
+          <w:tab w:val="left" w:pos="1268"/>
+        </w:tabs>
+        <w:spacing w:after="160" w:line="259" w:lineRule="auto"/>
+        <w:ind w:left="810"/>
+        <w:jc w:val="both"/>
+        <w:rPr>
+          <w:rFonts w:ascii="Times New Roman" w:hAnsi="Times New Roman" w:cs="Times New Roman"/>
+          <w:color w:val="auto"/>
+          <w:sz w:val="24"/>
+          <w:szCs w:val="24"/>
+        </w:rPr>
+      </w:pPr>
+    </w:p>
+    <w:p>
+      <w:pPr>
+        <w:tabs>
+          <w:tab w:val="left" w:pos="1268"/>
+        </w:tabs>
+        <w:spacing w:after="160" w:line="259" w:lineRule="auto"/>
+        <w:ind w:left="810"/>
+        <w:jc w:val="both"/>
+        <w:rPr>
+          <w:rFonts w:ascii="Times New Roman" w:hAnsi="Times New Roman" w:cs="Times New Roman"/>
+          <w:color w:val="auto"/>
+          <w:sz w:val="24"/>
+          <w:szCs w:val="24"/>
+        </w:rPr>
+      </w:pPr>
+      <w:r>
+        <w:rPr>
+          <w:rFonts w:ascii="Times New Roman" w:hAnsi="Times New Roman" w:cs="Times New Roman"/>
+          <w:color w:val="auto"/>
+          <w:sz w:val="24"/>
+          <w:szCs w:val="24"/>
+        </w:rPr>
+        <w:t>        //add elements to list</w:t>
+      </w:r>
+    </w:p>
+    <w:p>
+      <w:pPr>
+        <w:tabs>
+          <w:tab w:val="left" w:pos="1268"/>
+        </w:tabs>
+        <w:spacing w:after="160" w:line="259" w:lineRule="auto"/>
+        <w:ind w:left="810"/>
+        <w:jc w:val="both"/>
+        <w:rPr>
+          <w:rFonts w:ascii="Times New Roman" w:hAnsi="Times New Roman" w:cs="Times New Roman"/>
+          <w:color w:val="auto"/>
+          <w:sz w:val="24"/>
+          <w:szCs w:val="24"/>
+        </w:rPr>
+      </w:pPr>
+      <w:r>
+        <w:rPr>
+          <w:rFonts w:ascii="Times New Roman" w:hAnsi="Times New Roman" w:cs="Times New Roman"/>
+          <w:color w:val="auto"/>
+          <w:sz w:val="24"/>
+          <w:szCs w:val="24"/>
+        </w:rPr>
+        <w:t xml:space="preserve">        </w:t>
+      </w:r>
+      <w:proofErr w:type="spellStart"/>
+      <w:r>
+        <w:rPr>
+          <w:rFonts w:ascii="Times New Roman" w:hAnsi="Times New Roman" w:cs="Times New Roman"/>
+          <w:color w:val="auto"/>
+          <w:sz w:val="24"/>
+          <w:szCs w:val="24"/>
+        </w:rPr>
+        <w:t>fru_list.add</w:t>
+      </w:r>
+      <w:proofErr w:type="spellEnd"/>
+      <w:r>
+        <w:rPr>
+          <w:rFonts w:ascii="Times New Roman" w:hAnsi="Times New Roman" w:cs="Times New Roman"/>
+          <w:color w:val="auto"/>
+          <w:sz w:val="24"/>
+          <w:szCs w:val="24"/>
+        </w:rPr>
+        <w:t>("Watermelon"</w:t>
+      </w:r>
+      <w:proofErr w:type="gramStart"/>
+      <w:r>
+        <w:rPr>
+          <w:rFonts w:ascii="Times New Roman" w:hAnsi="Times New Roman" w:cs="Times New Roman"/>
+          <w:color w:val="auto"/>
+          <w:sz w:val="24"/>
+          <w:szCs w:val="24"/>
+        </w:rPr>
+        <w:t>);</w:t>
+      </w:r>
+      <w:proofErr w:type="gramEnd"/>
+    </w:p>
+    <w:p>
+      <w:pPr>
+        <w:tabs>
+          <w:tab w:val="left" w:pos="1268"/>
+        </w:tabs>
+        <w:spacing w:after="160" w:line="259" w:lineRule="auto"/>
+        <w:ind w:left="810"/>
+        <w:jc w:val="both"/>
+        <w:rPr>
+          <w:rFonts w:ascii="Times New Roman" w:hAnsi="Times New Roman" w:cs="Times New Roman"/>
+          <w:color w:val="auto"/>
+          <w:sz w:val="24"/>
+          <w:szCs w:val="24"/>
+        </w:rPr>
+      </w:pPr>
+      <w:r>
+        <w:rPr>
+          <w:rFonts w:ascii="Times New Roman" w:hAnsi="Times New Roman" w:cs="Times New Roman"/>
+          <w:color w:val="auto"/>
+          <w:sz w:val="24"/>
+          <w:szCs w:val="24"/>
+        </w:rPr>
+        <w:t xml:space="preserve">        </w:t>
+      </w:r>
+      <w:proofErr w:type="spellStart"/>
+      <w:r>
+        <w:rPr>
+          <w:rFonts w:ascii="Times New Roman" w:hAnsi="Times New Roman" w:cs="Times New Roman"/>
+          <w:color w:val="auto"/>
+          <w:sz w:val="24"/>
+          <w:szCs w:val="24"/>
+        </w:rPr>
+        <w:t>fru_list.add</w:t>
+      </w:r>
+      <w:proofErr w:type="spellEnd"/>
+      <w:r>
+        <w:rPr>
+          <w:rFonts w:ascii="Times New Roman" w:hAnsi="Times New Roman" w:cs="Times New Roman"/>
+          <w:color w:val="auto"/>
+          <w:sz w:val="24"/>
+          <w:szCs w:val="24"/>
+        </w:rPr>
+        <w:t>("Apple"</w:t>
+      </w:r>
+      <w:proofErr w:type="gramStart"/>
+      <w:r>
+        <w:rPr>
+          <w:rFonts w:ascii="Times New Roman" w:hAnsi="Times New Roman" w:cs="Times New Roman"/>
+          <w:color w:val="auto"/>
+          <w:sz w:val="24"/>
+          <w:szCs w:val="24"/>
+        </w:rPr>
+        <w:t>);</w:t>
+      </w:r>
+      <w:proofErr w:type="gramEnd"/>
+    </w:p>
+    <w:p>
+      <w:pPr>
+        <w:tabs>
+          <w:tab w:val="left" w:pos="1268"/>
+        </w:tabs>
+        <w:spacing w:after="160" w:line="259" w:lineRule="auto"/>
+        <w:ind w:left="810"/>
+        <w:jc w:val="both"/>
+        <w:rPr>
+          <w:rFonts w:ascii="Times New Roman" w:hAnsi="Times New Roman" w:cs="Times New Roman"/>
+          <w:color w:val="auto"/>
+          <w:sz w:val="24"/>
+          <w:szCs w:val="24"/>
+        </w:rPr>
+      </w:pPr>
+      <w:r>
+        <w:rPr>
+          <w:rFonts w:ascii="Times New Roman" w:hAnsi="Times New Roman" w:cs="Times New Roman"/>
+          <w:color w:val="auto"/>
+          <w:sz w:val="24"/>
+          <w:szCs w:val="24"/>
+        </w:rPr>
+        <w:t xml:space="preserve">        </w:t>
+      </w:r>
+      <w:proofErr w:type="spellStart"/>
+      <w:r>
+        <w:rPr>
+          <w:rFonts w:ascii="Times New Roman" w:hAnsi="Times New Roman" w:cs="Times New Roman"/>
+          <w:color w:val="auto"/>
+          <w:sz w:val="24"/>
+          <w:szCs w:val="24"/>
+        </w:rPr>
+        <w:t>fru_list.add</w:t>
+      </w:r>
+      <w:proofErr w:type="spellEnd"/>
+      <w:r>
+        <w:rPr>
+          <w:rFonts w:ascii="Times New Roman" w:hAnsi="Times New Roman" w:cs="Times New Roman"/>
+          <w:color w:val="auto"/>
+          <w:sz w:val="24"/>
+          <w:szCs w:val="24"/>
+        </w:rPr>
+        <w:t>("Cherry"</w:t>
+      </w:r>
+      <w:proofErr w:type="gramStart"/>
+      <w:r>
+        <w:rPr>
+          <w:rFonts w:ascii="Times New Roman" w:hAnsi="Times New Roman" w:cs="Times New Roman"/>
+          <w:color w:val="auto"/>
+          <w:sz w:val="24"/>
+          <w:szCs w:val="24"/>
+        </w:rPr>
+        <w:t>);</w:t>
+      </w:r>
+      <w:proofErr w:type="gramEnd"/>
+    </w:p>
+    <w:p>
+      <w:pPr>
+        <w:tabs>
+          <w:tab w:val="left" w:pos="1268"/>
+        </w:tabs>
+        <w:spacing w:after="160" w:line="259" w:lineRule="auto"/>
+        <w:ind w:left="810"/>
+        <w:jc w:val="both"/>
+        <w:rPr>
+          <w:rFonts w:ascii="Times New Roman" w:hAnsi="Times New Roman" w:cs="Times New Roman"/>
+          <w:color w:val="auto"/>
+          <w:sz w:val="24"/>
+          <w:szCs w:val="24"/>
+        </w:rPr>
+      </w:pPr>
+      <w:r>
+        <w:rPr>
+          <w:rFonts w:ascii="Times New Roman" w:hAnsi="Times New Roman" w:cs="Times New Roman"/>
+          <w:color w:val="auto"/>
+          <w:sz w:val="24"/>
+          <w:szCs w:val="24"/>
+        </w:rPr>
+        <w:t xml:space="preserve">        </w:t>
+      </w:r>
+      <w:proofErr w:type="spellStart"/>
+      <w:r>
+        <w:rPr>
+          <w:rFonts w:ascii="Times New Roman" w:hAnsi="Times New Roman" w:cs="Times New Roman"/>
+          <w:color w:val="auto"/>
+          <w:sz w:val="24"/>
+          <w:szCs w:val="24"/>
+        </w:rPr>
+        <w:t>fru_list.add</w:t>
+      </w:r>
+      <w:proofErr w:type="spellEnd"/>
+      <w:r>
+        <w:rPr>
+          <w:rFonts w:ascii="Times New Roman" w:hAnsi="Times New Roman" w:cs="Times New Roman"/>
+          <w:color w:val="auto"/>
+          <w:sz w:val="24"/>
+          <w:szCs w:val="24"/>
+        </w:rPr>
+        <w:t>("Banana"</w:t>
+      </w:r>
+      <w:proofErr w:type="gramStart"/>
+      <w:r>
+        <w:rPr>
+          <w:rFonts w:ascii="Times New Roman" w:hAnsi="Times New Roman" w:cs="Times New Roman"/>
+          <w:color w:val="auto"/>
+          <w:sz w:val="24"/>
+          <w:szCs w:val="24"/>
+        </w:rPr>
+        <w:t>);</w:t>
+      </w:r>
+      <w:proofErr w:type="gramEnd"/>
+    </w:p>
+    <w:p>
+      <w:pPr>
+        <w:tabs>
+          <w:tab w:val="left" w:pos="1268"/>
+        </w:tabs>
+        <w:spacing w:after="160" w:line="259" w:lineRule="auto"/>
+        <w:ind w:left="810"/>
+        <w:jc w:val="both"/>
+        <w:rPr>
+          <w:rFonts w:ascii="Times New Roman" w:hAnsi="Times New Roman" w:cs="Times New Roman"/>
+          <w:color w:val="auto"/>
+          <w:sz w:val="24"/>
+          <w:szCs w:val="24"/>
+        </w:rPr>
+      </w:pPr>
+    </w:p>
+    <w:p>
+      <w:pPr>
+        <w:tabs>
+          <w:tab w:val="left" w:pos="1268"/>
+        </w:tabs>
+        <w:spacing w:after="160" w:line="259" w:lineRule="auto"/>
+        <w:ind w:left="810"/>
+        <w:jc w:val="both"/>
+        <w:rPr>
+          <w:rFonts w:ascii="Times New Roman" w:hAnsi="Times New Roman" w:cs="Times New Roman"/>
+          <w:color w:val="auto"/>
+          <w:sz w:val="24"/>
+          <w:szCs w:val="24"/>
+        </w:rPr>
+      </w:pPr>
+      <w:r>
+        <w:rPr>
+          <w:rFonts w:ascii="Times New Roman" w:hAnsi="Times New Roman" w:cs="Times New Roman"/>
+          <w:color w:val="auto"/>
+          <w:sz w:val="24"/>
+          <w:szCs w:val="24"/>
+        </w:rPr>
+        <w:t xml:space="preserve">        //print the </w:t>
+      </w:r>
+      <w:proofErr w:type="spellStart"/>
+      <w:r>
+        <w:rPr>
+          <w:rFonts w:ascii="Times New Roman" w:hAnsi="Times New Roman" w:cs="Times New Roman"/>
+          <w:color w:val="auto"/>
+          <w:sz w:val="24"/>
+          <w:szCs w:val="24"/>
+        </w:rPr>
+        <w:t>inital</w:t>
+      </w:r>
+      <w:proofErr w:type="spellEnd"/>
+      <w:r>
+        <w:rPr>
+          <w:rFonts w:ascii="Times New Roman" w:hAnsi="Times New Roman" w:cs="Times New Roman"/>
+          <w:color w:val="auto"/>
+          <w:sz w:val="24"/>
+          <w:szCs w:val="24"/>
+        </w:rPr>
+        <w:t xml:space="preserve"> contents before modifications</w:t>
+      </w:r>
+    </w:p>
+    <w:p>
+      <w:pPr>
+        <w:tabs>
+          <w:tab w:val="left" w:pos="1268"/>
+        </w:tabs>
+        <w:spacing w:after="160" w:line="259" w:lineRule="auto"/>
+        <w:ind w:left="810"/>
+        <w:jc w:val="both"/>
+        <w:rPr>
+          <w:rFonts w:ascii="Times New Roman" w:hAnsi="Times New Roman" w:cs="Times New Roman"/>
+          <w:color w:val="auto"/>
+          <w:sz w:val="24"/>
+          <w:szCs w:val="24"/>
+        </w:rPr>
+      </w:pPr>
+      <w:r>
+        <w:rPr>
+          <w:rFonts w:ascii="Times New Roman" w:hAnsi="Times New Roman" w:cs="Times New Roman"/>
+          <w:color w:val="auto"/>
+          <w:sz w:val="24"/>
+          <w:szCs w:val="24"/>
+        </w:rPr>
+        <w:t xml:space="preserve">        </w:t>
+      </w:r>
+      <w:proofErr w:type="spellStart"/>
+      <w:r>
+        <w:rPr>
+          <w:rFonts w:ascii="Times New Roman" w:hAnsi="Times New Roman" w:cs="Times New Roman"/>
+          <w:color w:val="auto"/>
+          <w:sz w:val="24"/>
+          <w:szCs w:val="24"/>
+        </w:rPr>
+        <w:t>System.out.println</w:t>
+      </w:r>
+      <w:proofErr w:type="spellEnd"/>
+      <w:r>
+        <w:rPr>
+          <w:rFonts w:ascii="Times New Roman" w:hAnsi="Times New Roman" w:cs="Times New Roman"/>
+          <w:color w:val="auto"/>
+          <w:sz w:val="24"/>
+          <w:szCs w:val="24"/>
+        </w:rPr>
+        <w:t xml:space="preserve">("Given Linked List: " + </w:t>
+      </w:r>
+      <w:proofErr w:type="spellStart"/>
+      <w:r>
+        <w:rPr>
+          <w:rFonts w:ascii="Times New Roman" w:hAnsi="Times New Roman" w:cs="Times New Roman"/>
+          <w:color w:val="auto"/>
+          <w:sz w:val="24"/>
+          <w:szCs w:val="24"/>
+        </w:rPr>
+        <w:t>fru_list</w:t>
+      </w:r>
+      <w:proofErr w:type="spellEnd"/>
+      <w:proofErr w:type="gramStart"/>
+      <w:r>
+        <w:rPr>
+          <w:rFonts w:ascii="Times New Roman" w:hAnsi="Times New Roman" w:cs="Times New Roman"/>
+          <w:color w:val="auto"/>
+          <w:sz w:val="24"/>
+          <w:szCs w:val="24"/>
+        </w:rPr>
+        <w:t>);</w:t>
+      </w:r>
+      <w:proofErr w:type="gramEnd"/>
+    </w:p>
+    <w:p>
+      <w:pPr>
+        <w:tabs>
+          <w:tab w:val="left" w:pos="1268"/>
+        </w:tabs>
+        <w:spacing w:after="160" w:line="259" w:lineRule="auto"/>
+        <w:ind w:left="810"/>
+        <w:jc w:val="both"/>
+        <w:rPr>
+          <w:rFonts w:ascii="Times New Roman" w:hAnsi="Times New Roman" w:cs="Times New Roman"/>
+          <w:color w:val="auto"/>
+          <w:sz w:val="24"/>
+          <w:szCs w:val="24"/>
+        </w:rPr>
+      </w:pPr>
+    </w:p>
+    <w:p>
+      <w:pPr>
+        <w:tabs>
+          <w:tab w:val="left" w:pos="1268"/>
+        </w:tabs>
+        <w:spacing w:after="160" w:line="259" w:lineRule="auto"/>
+        <w:ind w:left="810"/>
+        <w:jc w:val="both"/>
+        <w:rPr>
+          <w:rFonts w:ascii="Times New Roman" w:hAnsi="Times New Roman" w:cs="Times New Roman"/>
+          <w:color w:val="auto"/>
+          <w:sz w:val="24"/>
+          <w:szCs w:val="24"/>
+        </w:rPr>
+      </w:pPr>
+      <w:r>
+        <w:rPr>
+          <w:rFonts w:ascii="Times New Roman" w:hAnsi="Times New Roman" w:cs="Times New Roman"/>
+          <w:color w:val="auto"/>
+          <w:sz w:val="24"/>
+          <w:szCs w:val="24"/>
+        </w:rPr>
+        <w:t>        //Call set method on index 2 with "Pineapple"</w:t>
+      </w:r>
+    </w:p>
+    <w:p>
+      <w:pPr>
+        <w:tabs>
+          <w:tab w:val="left" w:pos="1268"/>
+        </w:tabs>
+        <w:spacing w:after="160" w:line="259" w:lineRule="auto"/>
+        <w:ind w:left="810"/>
+        <w:jc w:val="both"/>
+        <w:rPr>
+          <w:rFonts w:ascii="Times New Roman" w:hAnsi="Times New Roman" w:cs="Times New Roman"/>
+          <w:color w:val="auto"/>
+          <w:sz w:val="24"/>
+          <w:szCs w:val="24"/>
+        </w:rPr>
+      </w:pPr>
+      <w:r>
+        <w:rPr>
+          <w:rFonts w:ascii="Times New Roman" w:hAnsi="Times New Roman" w:cs="Times New Roman"/>
+          <w:color w:val="auto"/>
+          <w:sz w:val="24"/>
+          <w:szCs w:val="24"/>
+        </w:rPr>
+        <w:t xml:space="preserve">        </w:t>
+      </w:r>
+      <w:proofErr w:type="spellStart"/>
+      <w:r>
+        <w:rPr>
+          <w:rFonts w:ascii="Times New Roman" w:hAnsi="Times New Roman" w:cs="Times New Roman"/>
+          <w:color w:val="auto"/>
+          <w:sz w:val="24"/>
+          <w:szCs w:val="24"/>
+        </w:rPr>
+        <w:t>fru_list.set</w:t>
+      </w:r>
+      <w:proofErr w:type="spellEnd"/>
+      <w:r>
+        <w:rPr>
+          <w:rFonts w:ascii="Times New Roman" w:hAnsi="Times New Roman" w:cs="Times New Roman"/>
+          <w:color w:val="auto"/>
+          <w:sz w:val="24"/>
+          <w:szCs w:val="24"/>
+        </w:rPr>
+        <w:t>(2,"Pineapple"</w:t>
+      </w:r>
+      <w:proofErr w:type="gramStart"/>
+      <w:r>
+        <w:rPr>
+          <w:rFonts w:ascii="Times New Roman" w:hAnsi="Times New Roman" w:cs="Times New Roman"/>
+          <w:color w:val="auto"/>
+          <w:sz w:val="24"/>
+          <w:szCs w:val="24"/>
+        </w:rPr>
+        <w:t>);</w:t>
+      </w:r>
+      <w:proofErr w:type="gramEnd"/>
+    </w:p>
+    <w:p>
+      <w:pPr>
+        <w:tabs>
+          <w:tab w:val="left" w:pos="1268"/>
+        </w:tabs>
+        <w:spacing w:after="160" w:line="259" w:lineRule="auto"/>
+        <w:ind w:left="810"/>
+        <w:jc w:val="both"/>
+        <w:rPr>
+          <w:rFonts w:ascii="Times New Roman" w:hAnsi="Times New Roman" w:cs="Times New Roman"/>
+          <w:color w:val="auto"/>
+          <w:sz w:val="24"/>
+          <w:szCs w:val="24"/>
+        </w:rPr>
+      </w:pPr>
+    </w:p>
+    <w:p>
+      <w:pPr>
+        <w:tabs>
+          <w:tab w:val="left" w:pos="1268"/>
+        </w:tabs>
+        <w:spacing w:after="160" w:line="259" w:lineRule="auto"/>
+        <w:ind w:left="810"/>
+        <w:jc w:val="both"/>
+        <w:rPr>
+          <w:rFonts w:ascii="Times New Roman" w:hAnsi="Times New Roman" w:cs="Times New Roman"/>
+          <w:color w:val="auto"/>
+          <w:sz w:val="24"/>
+          <w:szCs w:val="24"/>
+        </w:rPr>
+      </w:pPr>
+      <w:r>
+        <w:rPr>
+          <w:rFonts w:ascii="Times New Roman" w:hAnsi="Times New Roman" w:cs="Times New Roman"/>
+          <w:color w:val="auto"/>
+          <w:sz w:val="24"/>
+          <w:szCs w:val="24"/>
+        </w:rPr>
+        <w:t>        //print Replace an Element in a linked list</w:t>
+      </w:r>
+    </w:p>
+    <w:p>
+      <w:pPr>
+        <w:tabs>
+          <w:tab w:val="left" w:pos="1268"/>
+        </w:tabs>
+        <w:spacing w:after="160" w:line="259" w:lineRule="auto"/>
+        <w:ind w:left="810"/>
+        <w:jc w:val="both"/>
+        <w:rPr>
+          <w:rFonts w:ascii="Times New Roman" w:hAnsi="Times New Roman" w:cs="Times New Roman"/>
+          <w:color w:val="auto"/>
+          <w:sz w:val="24"/>
+          <w:szCs w:val="24"/>
+        </w:rPr>
+      </w:pPr>
+      <w:r>
+        <w:rPr>
+          <w:rFonts w:ascii="Times New Roman" w:hAnsi="Times New Roman" w:cs="Times New Roman"/>
+          <w:color w:val="auto"/>
+          <w:sz w:val="24"/>
+          <w:szCs w:val="24"/>
+        </w:rPr>
+        <w:t xml:space="preserve">        </w:t>
+      </w:r>
+      <w:proofErr w:type="spellStart"/>
+      <w:r>
+        <w:rPr>
+          <w:rFonts w:ascii="Times New Roman" w:hAnsi="Times New Roman" w:cs="Times New Roman"/>
+          <w:color w:val="auto"/>
+          <w:sz w:val="24"/>
+          <w:szCs w:val="24"/>
+        </w:rPr>
+        <w:t>System.out.println</w:t>
+      </w:r>
+      <w:proofErr w:type="spellEnd"/>
+      <w:r>
+        <w:rPr>
+          <w:rFonts w:ascii="Times New Roman" w:hAnsi="Times New Roman" w:cs="Times New Roman"/>
+          <w:color w:val="auto"/>
+          <w:sz w:val="24"/>
+          <w:szCs w:val="24"/>
+        </w:rPr>
+        <w:t>("Replace an element in a Linked List"</w:t>
+      </w:r>
+      <w:proofErr w:type="gramStart"/>
+      <w:r>
+        <w:rPr>
+          <w:rFonts w:ascii="Times New Roman" w:hAnsi="Times New Roman" w:cs="Times New Roman"/>
+          <w:color w:val="auto"/>
+          <w:sz w:val="24"/>
+          <w:szCs w:val="24"/>
+        </w:rPr>
+        <w:t>);</w:t>
+      </w:r>
+      <w:proofErr w:type="gramEnd"/>
+    </w:p>
+    <w:p>
+      <w:pPr>
+        <w:tabs>
+          <w:tab w:val="left" w:pos="1268"/>
+        </w:tabs>
+        <w:spacing w:after="160" w:line="259" w:lineRule="auto"/>
+        <w:ind w:left="810"/>
+        <w:jc w:val="both"/>
+        <w:rPr>
+          <w:rFonts w:ascii="Times New Roman" w:hAnsi="Times New Roman" w:cs="Times New Roman"/>
+          <w:color w:val="auto"/>
+          <w:sz w:val="24"/>
+          <w:szCs w:val="24"/>
+        </w:rPr>
+      </w:pPr>
+    </w:p>
+    <w:p>
+      <w:pPr>
+        <w:tabs>
+          <w:tab w:val="left" w:pos="1268"/>
+        </w:tabs>
+        <w:spacing w:after="160" w:line="259" w:lineRule="auto"/>
+        <w:ind w:left="810"/>
+        <w:jc w:val="both"/>
+        <w:rPr>
+          <w:rFonts w:ascii="Times New Roman" w:hAnsi="Times New Roman" w:cs="Times New Roman"/>
+          <w:color w:val="auto"/>
+          <w:sz w:val="24"/>
+          <w:szCs w:val="24"/>
+        </w:rPr>
+      </w:pPr>
+      <w:r>
+        <w:rPr>
+          <w:rFonts w:ascii="Times New Roman" w:hAnsi="Times New Roman" w:cs="Times New Roman"/>
+          <w:color w:val="auto"/>
+          <w:sz w:val="24"/>
+          <w:szCs w:val="24"/>
+        </w:rPr>
+        <w:t xml:space="preserve">        //reprint New linked list: </w:t>
+      </w:r>
+      <w:proofErr w:type="spellStart"/>
+      <w:r>
+        <w:rPr>
+          <w:rFonts w:ascii="Times New Roman" w:hAnsi="Times New Roman" w:cs="Times New Roman"/>
+          <w:color w:val="auto"/>
+          <w:sz w:val="24"/>
+          <w:szCs w:val="24"/>
+        </w:rPr>
+        <w:t>fru_list</w:t>
+      </w:r>
+      <w:proofErr w:type="spellEnd"/>
+    </w:p>
+    <w:p>
+      <w:pPr>
+        <w:tabs>
+          <w:tab w:val="left" w:pos="1268"/>
+        </w:tabs>
+        <w:spacing w:after="160" w:line="259" w:lineRule="auto"/>
+        <w:ind w:left="810"/>
+        <w:jc w:val="both"/>
+        <w:rPr>
+          <w:rFonts w:ascii="Times New Roman" w:hAnsi="Times New Roman" w:cs="Times New Roman"/>
+          <w:color w:val="auto"/>
+          <w:sz w:val="24"/>
+          <w:szCs w:val="24"/>
+        </w:rPr>
+      </w:pPr>
+      <w:r>
+        <w:rPr>
+          <w:rFonts w:ascii="Times New Roman" w:hAnsi="Times New Roman" w:cs="Times New Roman"/>
+          <w:color w:val="auto"/>
+          <w:sz w:val="24"/>
+          <w:szCs w:val="24"/>
+        </w:rPr>
+        <w:t xml:space="preserve">        </w:t>
+      </w:r>
+      <w:proofErr w:type="spellStart"/>
+      <w:r>
+        <w:rPr>
+          <w:rFonts w:ascii="Times New Roman" w:hAnsi="Times New Roman" w:cs="Times New Roman"/>
+          <w:color w:val="auto"/>
+          <w:sz w:val="24"/>
+          <w:szCs w:val="24"/>
+        </w:rPr>
+        <w:t>System.out.println</w:t>
+      </w:r>
+      <w:proofErr w:type="spellEnd"/>
+      <w:r>
+        <w:rPr>
+          <w:rFonts w:ascii="Times New Roman" w:hAnsi="Times New Roman" w:cs="Times New Roman"/>
+          <w:color w:val="auto"/>
+          <w:sz w:val="24"/>
+          <w:szCs w:val="24"/>
+        </w:rPr>
+        <w:t xml:space="preserve">("New Linked List: " + </w:t>
+      </w:r>
+      <w:proofErr w:type="spellStart"/>
+      <w:r>
+        <w:rPr>
+          <w:rFonts w:ascii="Times New Roman" w:hAnsi="Times New Roman" w:cs="Times New Roman"/>
+          <w:color w:val="auto"/>
+          <w:sz w:val="24"/>
+          <w:szCs w:val="24"/>
+        </w:rPr>
+        <w:t>fru_list</w:t>
+      </w:r>
+      <w:proofErr w:type="spellEnd"/>
+      <w:proofErr w:type="gramStart"/>
+      <w:r>
+        <w:rPr>
+          <w:rFonts w:ascii="Times New Roman" w:hAnsi="Times New Roman" w:cs="Times New Roman"/>
+          <w:color w:val="auto"/>
+          <w:sz w:val="24"/>
+          <w:szCs w:val="24"/>
+        </w:rPr>
+        <w:t>);</w:t>
+      </w:r>
+      <w:proofErr w:type="gramEnd"/>
+    </w:p>
+    <w:p>
+      <w:pPr>
+        <w:tabs>
+          <w:tab w:val="left" w:pos="1268"/>
+        </w:tabs>
+        <w:spacing w:after="160" w:line="259" w:lineRule="auto"/>
+        <w:ind w:left="810"/>
+        <w:jc w:val="both"/>
+        <w:rPr>
+          <w:rFonts w:ascii="Times New Roman" w:hAnsi="Times New Roman" w:cs="Times New Roman"/>
+          <w:color w:val="auto"/>
+          <w:sz w:val="24"/>
+          <w:szCs w:val="24"/>
+        </w:rPr>
+      </w:pPr>
+      <w:r>
+        <w:rPr>
+          <w:rFonts w:ascii="Times New Roman" w:hAnsi="Times New Roman" w:cs="Times New Roman"/>
+          <w:color w:val="auto"/>
+          <w:sz w:val="24"/>
+          <w:szCs w:val="24"/>
+        </w:rPr>
+        <w:lastRenderedPageBreak/>
+        <w:t>    }</w:t>
+      </w:r>
+    </w:p>
+    <w:p>
+      <w:pPr>
+        <w:tabs>
+          <w:tab w:val="left" w:pos="1268"/>
+        </w:tabs>
+        <w:spacing w:after="160" w:line="259" w:lineRule="auto"/>
+        <w:ind w:left="810"/>
+        <w:jc w:val="both"/>
+        <w:rPr>
+          <w:rFonts w:ascii="Times New Roman" w:hAnsi="Times New Roman" w:cs="Times New Roman"/>
+          <w:color w:val="auto"/>
+          <w:sz w:val="24"/>
+          <w:szCs w:val="24"/>
+        </w:rPr>
+      </w:pPr>
+      <w:r>
+        <w:rPr>
+          <w:rFonts w:ascii="Times New Roman" w:hAnsi="Times New Roman" w:cs="Times New Roman"/>
+          <w:color w:val="auto"/>
+          <w:sz w:val="24"/>
+          <w:szCs w:val="24"/>
+        </w:rPr>
+        <w:t>    }</w:t>
+      </w:r>
+    </w:p>
+    <w:p>
+      <w:pPr>
+        <w:tabs>
+          <w:tab w:val="left" w:pos="1268"/>
+        </w:tabs>
+        <w:spacing w:after="160" w:line="259" w:lineRule="auto"/>
+        <w:ind w:left="810"/>
+        <w:jc w:val="both"/>
+        <w:rPr>
+          <w:rFonts w:ascii="Times New Roman" w:hAnsi="Times New Roman" w:cs="Times New Roman"/>
+          <w:color w:val="auto"/>
+          <w:sz w:val="24"/>
+          <w:szCs w:val="24"/>
+        </w:rPr>
+      </w:pPr>
+    </w:p>
+    <w:p>
+      <w:pPr>
+        <w:tabs>
+          <w:tab w:val="left" w:pos="1268"/>
+        </w:tabs>
+        <w:spacing w:after="160" w:line="259" w:lineRule="auto"/>
+        <w:ind w:left="810"/>
+        <w:jc w:val="both"/>
+        <w:rPr>
+          <w:rFonts w:ascii="Times New Roman" w:hAnsi="Times New Roman" w:cs="Times New Roman"/>
+          <w:b/>
+          <w:bCs/>
+          <w:color w:val="auto"/>
+          <w:sz w:val="24"/>
+          <w:szCs w:val="24"/>
+          <w:u w:val="single"/>
+        </w:rPr>
+      </w:pPr>
+      <w:r>
+        <w:rPr>
+          <w:rFonts w:ascii="Times New Roman" w:hAnsi="Times New Roman" w:cs="Times New Roman"/>
+          <w:b/>
+          <w:bCs/>
+          <w:color w:val="auto"/>
+          <w:sz w:val="24"/>
+          <w:szCs w:val="24"/>
+          <w:u w:val="single"/>
+        </w:rPr>
+        <w:t>Output</w:t>
+      </w:r>
+    </w:p>
+    <w:p>
+      <w:pPr>
+        <w:tabs>
+          <w:tab w:val="left" w:pos="1268"/>
+        </w:tabs>
+        <w:spacing w:after="160" w:line="259" w:lineRule="auto"/>
+        <w:ind w:left="810"/>
+        <w:jc w:val="both"/>
+        <w:rPr>
+          <w:rFonts w:ascii="Calibri" w:hAnsi="Calibri" w:cs="Calibri"/>
+          <w:b/>
+          <w:bCs/>
+          <w:color w:val="00B050"/>
+          <w:sz w:val="24"/>
+          <w:szCs w:val="24"/>
+          <w:u w:val="single"/>
+        </w:rPr>
+      </w:pPr>
+      <w:r>
+        <w:rPr>
+          <w:rFonts w:ascii="Calibri" w:hAnsi="Calibri" w:cs="Calibri"/>
+          <w:b/>
+          <w:bCs/>
+          <w:color w:val="00B050"/>
+          <w:sz w:val="24"/>
+          <w:szCs w:val="24"/>
+          <w:u w:val="single"/>
+        </w:rPr>
+        <w:t xml:space="preserve"> </w:t>
+      </w:r>
+      <w:r>
+        <w:rPr>
+          <w:rFonts w:ascii="Calibri" w:hAnsi="Calibri" w:cs="Calibri"/>
+          <w:b/>
+          <w:bCs/>
+          <w:noProof/>
+          <w:color w:val="00B050"/>
+          <w:sz w:val="24"/>
+          <w:szCs w:val="24"/>
+          <w:u w:val="single"/>
+        </w:rPr>
+        <w:drawing>
+          <wp:inline distT="0" distB="0" distL="0" distR="0" wp14:anchorId="4774ED54" wp14:editId="7D7C9A2C">
+            <wp:extent cx="4753638" cy="1238423"/>
+            <wp:effectExtent l="0" t="0" r="0" b="0"/>
+            <wp:docPr id="872193304" name="Picture 1" descr="A computer screen shot of a computer code&#10;&#10;AI-generated content may be incorrect."/>
+            <wp:cNvGraphicFramePr>
+              <a:graphicFrameLocks xmlns:a="http://schemas.openxmlformats.org/drawingml/2006/main" noChangeAspect="1"/>
+            </wp:cNvGraphicFramePr>
+            <a:graphic xmlns:a="http://schemas.openxmlformats.org/drawingml/2006/main">
+              <a:graphicData uri="http://schemas.openxmlformats.org/drawingml/2006/picture">
+                <pic:pic xmlns:pic="http://schemas.openxmlformats.org/drawingml/2006/picture">
+                  <pic:nvPicPr>
+                    <pic:cNvPr id="872193304" name="Picture 1" descr="A computer screen shot of a computer code&#10;&#10;AI-generated content may be incorrect."/>
+                    <pic:cNvPicPr/>
+                  </pic:nvPicPr>
+                  <pic:blipFill>
+                    <a:blip r:embed="rId16"/>
+                    <a:stretch>
+                      <a:fillRect/>
+                    </a:stretch>
+                  </pic:blipFill>
+                  <pic:spPr>
+                    <a:xfrm>
+                      <a:off x="0" y="0"/>
+                      <a:ext cx="4753638" cy="1238423"/>
+                    </a:xfrm>
+                    <a:prstGeom prst="rect">
+                      <a:avLst/>
+                    </a:prstGeom>
+                  </pic:spPr>
+                </pic:pic>
+              </a:graphicData>
+            </a:graphic>
+          </wp:inline>
+        </w:drawing>
       </w:r>
     </w:p>
     <w:p>
@@ -7487,7 +7521,7 @@
       </w:pPr>
     </w:p>
     <w:sectPr>
-      <w:headerReference w:type="default" r:id="rId16"/>
+      <w:headerReference w:type="default" r:id="rId17"/>
       <w:pgSz w:w="12240" w:h="15840" w:code="1"/>
       <w:pgMar w:top="1080" w:right="720" w:bottom="2160" w:left="3096" w:header="1080" w:footer="720" w:gutter="0"/>
       <w:pgNumType w:start="1"/>
@@ -10551,6 +10585,7 @@
     <w:rsid w:val="00051231"/>
     <w:rsid w:val="000960E2"/>
     <w:rsid w:val="000B52FC"/>
+    <w:rsid w:val="000B5834"/>
     <w:rsid w:val="000C6816"/>
     <w:rsid w:val="000D160C"/>
     <w:rsid w:val="000D1EF2"/>
@@ -10560,6 +10595,7 @@
     <w:rsid w:val="001A78F8"/>
     <w:rsid w:val="00204B77"/>
     <w:rsid w:val="002577A3"/>
+    <w:rsid w:val="002D0E7C"/>
     <w:rsid w:val="00324ACF"/>
     <w:rsid w:val="00334A7B"/>
     <w:rsid w:val="00356A75"/>
@@ -10612,6 +10648,7 @@
     <w:rsid w:val="00E50853"/>
     <w:rsid w:val="00E552F8"/>
     <w:rsid w:val="00EF0564"/>
+    <w:rsid w:val="00FC586D"/>
   </w:rsids>
   <m:mathPr>
     <m:mathFont m:val="Cambria Math"/>

</xml_diff>